<commit_message>
Add charts to final report
</commit_message>
<xml_diff>
--- a/자동차_연비_예측_최종보고서.docx
+++ b/자동차_연비_예측_최종보고서.docx
@@ -39,7 +39,8 @@
         <w:rPr>
           <w:rFonts w:ascii="맑은 고딕" w:hAnsi="맑은 고딕" w:eastAsia="맑은 고딕"/>
           <w:b/>
-          <w:sz w:val="36"/>
+          <w:color w:val="162033"/>
+          <w:sz w:val="32"/>
         </w:rPr>
         <w:t>1. 프로젝트 개요</w:t>
       </w:r>
@@ -54,7 +55,7 @@
           <w:b w:val="0"/>
           <w:sz w:val="21"/>
         </w:rPr>
-        <w:t>본 프로젝트는 자동차 제원 데이터를 활용하여 예상 연비(MPG)를 예측하는 머신러닝 모델을 학습하고, 최종 선택 모델을 Streamlit 웹 앱으로 구현한 결과물이다. 사용자는 실린더 수, 배기량, 마력, 무게, 가속력, 연식을 입력하여 예상 연비를 확인할 수 있다.</w:t>
+        <w:t>본 프로젝트는 자동차의 실린더 수, 배기량, 마력, 무게, 가속력, 연식을 이용하여 예상 연비(MPG)를 예측하는 머신러닝 프로젝트이다. 여러 회귀 모델을 동일한 데이터로 학습시킨 뒤 성능을 비교하고, 가장 좋은 모델을 Streamlit 웹 앱에 적용하였다.</w:t>
       </w:r>
     </w:p>
     <w:p>
@@ -65,7 +66,8 @@
         <w:rPr>
           <w:rFonts w:ascii="맑은 고딕" w:hAnsi="맑은 고딕" w:eastAsia="맑은 고딕"/>
           <w:b/>
-          <w:sz w:val="36"/>
+          <w:color w:val="162033"/>
+          <w:sz w:val="32"/>
         </w:rPr>
         <w:t>2. 제출 산출물 구성</w:t>
       </w:r>
@@ -78,14 +80,14 @@
         <w:tblLook w:firstColumn="1" w:firstRow="1" w:lastColumn="0" w:lastRow="0" w:noHBand="0" w:noVBand="1" w:val="04A0"/>
       </w:tblPr>
       <w:tblGrid>
-        <w:gridCol w:w="2880"/>
-        <w:gridCol w:w="2880"/>
-        <w:gridCol w:w="2880"/>
+        <w:gridCol w:w="3360"/>
+        <w:gridCol w:w="3360"/>
+        <w:gridCol w:w="3360"/>
       </w:tblGrid>
       <w:tr>
         <w:tc>
           <w:tcPr>
-            <w:tcW w:type="dxa" w:w="2880"/>
+            <w:tcW w:type="dxa" w:w="3360"/>
             <w:vAlign w:val="center"/>
             <w:shd w:fill="D9EAF7"/>
           </w:tcPr>
@@ -95,7 +97,7 @@
               <w:rPr>
                 <w:rFonts w:ascii="맑은 고딕" w:hAnsi="맑은 고딕" w:eastAsia="맑은 고딕"/>
                 <w:b/>
-                <w:sz w:val="19"/>
+                <w:sz w:val="18"/>
               </w:rPr>
               <w:t>구분</w:t>
             </w:r>
@@ -103,7 +105,7 @@
         </w:tc>
         <w:tc>
           <w:tcPr>
-            <w:tcW w:type="dxa" w:w="2880"/>
+            <w:tcW w:type="dxa" w:w="3360"/>
             <w:vAlign w:val="center"/>
             <w:shd w:fill="D9EAF7"/>
           </w:tcPr>
@@ -113,15 +115,15 @@
               <w:rPr>
                 <w:rFonts w:ascii="맑은 고딕" w:hAnsi="맑은 고딕" w:eastAsia="맑은 고딕"/>
                 <w:b/>
-                <w:sz w:val="19"/>
+                <w:sz w:val="18"/>
               </w:rPr>
-              <w:t>파일 또는 내용</w:t>
+              <w:t>파일</w:t>
             </w:r>
           </w:p>
         </w:tc>
         <w:tc>
           <w:tcPr>
-            <w:tcW w:type="dxa" w:w="2880"/>
+            <w:tcW w:type="dxa" w:w="3360"/>
             <w:vAlign w:val="center"/>
             <w:shd w:fill="D9EAF7"/>
           </w:tcPr>
@@ -131,7 +133,7 @@
               <w:rPr>
                 <w:rFonts w:ascii="맑은 고딕" w:hAnsi="맑은 고딕" w:eastAsia="맑은 고딕"/>
                 <w:b/>
-                <w:sz w:val="19"/>
+                <w:sz w:val="18"/>
               </w:rPr>
               <w:t>설명</w:t>
             </w:r>
@@ -141,7 +143,7 @@
       <w:tr>
         <w:tc>
           <w:tcPr>
-            <w:tcW w:type="dxa" w:w="2880"/>
+            <w:tcW w:type="dxa" w:w="3360"/>
             <w:vAlign w:val="center"/>
           </w:tcPr>
           <w:p>
@@ -150,7 +152,7 @@
               <w:rPr>
                 <w:rFonts w:ascii="맑은 고딕" w:hAnsi="맑은 고딕" w:eastAsia="맑은 고딕"/>
                 <w:b w:val="0"/>
-                <w:sz w:val="19"/>
+                <w:sz w:val="18"/>
               </w:rPr>
               <w:t>모델 학습 파일</w:t>
             </w:r>
@@ -158,7 +160,7 @@
         </w:tc>
         <w:tc>
           <w:tcPr>
-            <w:tcW w:type="dxa" w:w="2880"/>
+            <w:tcW w:type="dxa" w:w="3360"/>
             <w:vAlign w:val="center"/>
           </w:tcPr>
           <w:p>
@@ -167,7 +169,7 @@
               <w:rPr>
                 <w:rFonts w:ascii="맑은 고딕" w:hAnsi="맑은 고딕" w:eastAsia="맑은 고딕"/>
                 <w:b w:val="0"/>
-                <w:sz w:val="19"/>
+                <w:sz w:val="18"/>
               </w:rPr>
               <w:t>car_mpg_training.ipynb</w:t>
             </w:r>
@@ -175,7 +177,7 @@
         </w:tc>
         <w:tc>
           <w:tcPr>
-            <w:tcW w:type="dxa" w:w="2880"/>
+            <w:tcW w:type="dxa" w:w="3360"/>
             <w:vAlign w:val="center"/>
           </w:tcPr>
           <w:p>
@@ -184,7 +186,7 @@
               <w:rPr>
                 <w:rFonts w:ascii="맑은 고딕" w:hAnsi="맑은 고딕" w:eastAsia="맑은 고딕"/>
                 <w:b w:val="0"/>
-                <w:sz w:val="19"/>
+                <w:sz w:val="18"/>
               </w:rPr>
               <w:t>데이터 로드, 전처리, 모델 학습, 성능 비교 과정을 정리한 Jupyter Notebook</w:t>
             </w:r>
@@ -194,7 +196,7 @@
       <w:tr>
         <w:tc>
           <w:tcPr>
-            <w:tcW w:type="dxa" w:w="2880"/>
+            <w:tcW w:type="dxa" w:w="3360"/>
             <w:vAlign w:val="center"/>
           </w:tcPr>
           <w:p>
@@ -203,7 +205,7 @@
               <w:rPr>
                 <w:rFonts w:ascii="맑은 고딕" w:hAnsi="맑은 고딕" w:eastAsia="맑은 고딕"/>
                 <w:b w:val="0"/>
-                <w:sz w:val="19"/>
+                <w:sz w:val="18"/>
               </w:rPr>
               <w:t>Streamlit 앱</w:t>
             </w:r>
@@ -211,7 +213,7 @@
         </w:tc>
         <w:tc>
           <w:tcPr>
-            <w:tcW w:type="dxa" w:w="2880"/>
+            <w:tcW w:type="dxa" w:w="3360"/>
             <w:vAlign w:val="center"/>
           </w:tcPr>
           <w:p>
@@ -220,7 +222,7 @@
               <w:rPr>
                 <w:rFonts w:ascii="맑은 고딕" w:hAnsi="맑은 고딕" w:eastAsia="맑은 고딕"/>
                 <w:b w:val="0"/>
-                <w:sz w:val="19"/>
+                <w:sz w:val="18"/>
               </w:rPr>
               <w:t>app.py</w:t>
             </w:r>
@@ -228,7 +230,7 @@
         </w:tc>
         <w:tc>
           <w:tcPr>
-            <w:tcW w:type="dxa" w:w="2880"/>
+            <w:tcW w:type="dxa" w:w="3360"/>
             <w:vAlign w:val="center"/>
           </w:tcPr>
           <w:p>
@@ -237,7 +239,7 @@
               <w:rPr>
                 <w:rFonts w:ascii="맑은 고딕" w:hAnsi="맑은 고딕" w:eastAsia="맑은 고딕"/>
                 <w:b w:val="0"/>
-                <w:sz w:val="19"/>
+                <w:sz w:val="18"/>
               </w:rPr>
               <w:t>사용자 입력값으로 예상 MPG를 계산하는 웹 앱</w:t>
             </w:r>
@@ -247,7 +249,7 @@
       <w:tr>
         <w:tc>
           <w:tcPr>
-            <w:tcW w:type="dxa" w:w="2880"/>
+            <w:tcW w:type="dxa" w:w="3360"/>
             <w:vAlign w:val="center"/>
           </w:tcPr>
           <w:p>
@@ -256,7 +258,7 @@
               <w:rPr>
                 <w:rFonts w:ascii="맑은 고딕" w:hAnsi="맑은 고딕" w:eastAsia="맑은 고딕"/>
                 <w:b w:val="0"/>
-                <w:sz w:val="19"/>
+                <w:sz w:val="18"/>
               </w:rPr>
               <w:t>의존성 파일</w:t>
             </w:r>
@@ -264,7 +266,7 @@
         </w:tc>
         <w:tc>
           <w:tcPr>
-            <w:tcW w:type="dxa" w:w="2880"/>
+            <w:tcW w:type="dxa" w:w="3360"/>
             <w:vAlign w:val="center"/>
           </w:tcPr>
           <w:p>
@@ -273,7 +275,7 @@
               <w:rPr>
                 <w:rFonts w:ascii="맑은 고딕" w:hAnsi="맑은 고딕" w:eastAsia="맑은 고딕"/>
                 <w:b w:val="0"/>
-                <w:sz w:val="19"/>
+                <w:sz w:val="18"/>
               </w:rPr>
               <w:t>requirements.txt</w:t>
             </w:r>
@@ -281,7 +283,7 @@
         </w:tc>
         <w:tc>
           <w:tcPr>
-            <w:tcW w:type="dxa" w:w="2880"/>
+            <w:tcW w:type="dxa" w:w="3360"/>
             <w:vAlign w:val="center"/>
           </w:tcPr>
           <w:p>
@@ -290,7 +292,7 @@
               <w:rPr>
                 <w:rFonts w:ascii="맑은 고딕" w:hAnsi="맑은 고딕" w:eastAsia="맑은 고딕"/>
                 <w:b w:val="0"/>
-                <w:sz w:val="19"/>
+                <w:sz w:val="18"/>
               </w:rPr>
               <w:t>Streamlit Cloud 배포에 필요한 라이브러리 목록</w:t>
             </w:r>
@@ -300,7 +302,7 @@
       <w:tr>
         <w:tc>
           <w:tcPr>
-            <w:tcW w:type="dxa" w:w="2880"/>
+            <w:tcW w:type="dxa" w:w="3360"/>
             <w:vAlign w:val="center"/>
           </w:tcPr>
           <w:p>
@@ -309,15 +311,15 @@
               <w:rPr>
                 <w:rFonts w:ascii="맑은 고딕" w:hAnsi="맑은 고딕" w:eastAsia="맑은 고딕"/>
                 <w:b w:val="0"/>
-                <w:sz w:val="19"/>
+                <w:sz w:val="18"/>
               </w:rPr>
-              <w:t>보고서</w:t>
+              <w:t>최종 보고서</w:t>
             </w:r>
           </w:p>
         </w:tc>
         <w:tc>
           <w:tcPr>
-            <w:tcW w:type="dxa" w:w="2880"/>
+            <w:tcW w:type="dxa" w:w="3360"/>
             <w:vAlign w:val="center"/>
           </w:tcPr>
           <w:p>
@@ -326,7 +328,7 @@
               <w:rPr>
                 <w:rFonts w:ascii="맑은 고딕" w:hAnsi="맑은 고딕" w:eastAsia="맑은 고딕"/>
                 <w:b w:val="0"/>
-                <w:sz w:val="19"/>
+                <w:sz w:val="18"/>
               </w:rPr>
               <w:t>자동차_연비_예측_최종보고서.docx</w:t>
             </w:r>
@@ -334,7 +336,7 @@
         </w:tc>
         <w:tc>
           <w:tcPr>
-            <w:tcW w:type="dxa" w:w="2880"/>
+            <w:tcW w:type="dxa" w:w="3360"/>
             <w:vAlign w:val="center"/>
           </w:tcPr>
           <w:p>
@@ -343,9 +345,9 @@
               <w:rPr>
                 <w:rFonts w:ascii="맑은 고딕" w:hAnsi="맑은 고딕" w:eastAsia="맑은 고딕"/>
                 <w:b w:val="0"/>
-                <w:sz w:val="19"/>
+                <w:sz w:val="18"/>
               </w:rPr>
-              <w:t>프로젝트 수행 과정과 결과 정리</w:t>
+              <w:t>학습 과정, 그래프, 결과 해석을 정리한 한글 보고서</w:t>
             </w:r>
           </w:p>
         </w:tc>
@@ -360,7 +362,8 @@
         <w:rPr>
           <w:rFonts w:ascii="맑은 고딕" w:hAnsi="맑은 고딕" w:eastAsia="맑은 고딕"/>
           <w:b/>
-          <w:sz w:val="36"/>
+          <w:color w:val="162033"/>
+          <w:sz w:val="32"/>
         </w:rPr>
         <w:t>3. 데이터 설명</w:t>
       </w:r>
@@ -375,7 +378,7 @@
           <w:b w:val="0"/>
           <w:sz w:val="21"/>
         </w:rPr>
-        <w:t>데이터는 Seaborn 예제 데이터인 mpg.csv를 사용하였다. 원 데이터는 UCI Auto MPG Dataset 기반이며, 본 프로젝트에서는 결측치를 제거한 뒤 mpg와 주요 제원 변수만 사용하였다.</w:t>
+        <w:t>데이터는 Auto MPG 공개 데이터셋을 사용하였다. 결측치가 있는 행은 제거하고, 연비 예측에 직접적으로 사용한 수치형 변수만 선택하였다.</w:t>
       </w:r>
     </w:p>
     <w:tbl>
@@ -386,13 +389,13 @@
         <w:tblLook w:firstColumn="1" w:firstRow="1" w:lastColumn="0" w:lastRow="0" w:noHBand="0" w:noVBand="1" w:val="04A0"/>
       </w:tblPr>
       <w:tblGrid>
-        <w:gridCol w:w="4320"/>
-        <w:gridCol w:w="4320"/>
+        <w:gridCol w:w="5040"/>
+        <w:gridCol w:w="5040"/>
       </w:tblGrid>
       <w:tr>
         <w:tc>
           <w:tcPr>
-            <w:tcW w:type="dxa" w:w="4320"/>
+            <w:tcW w:type="dxa" w:w="5040"/>
             <w:vAlign w:val="center"/>
             <w:shd w:fill="D9EAF7"/>
           </w:tcPr>
@@ -402,7 +405,7 @@
               <w:rPr>
                 <w:rFonts w:ascii="맑은 고딕" w:hAnsi="맑은 고딕" w:eastAsia="맑은 고딕"/>
                 <w:b/>
-                <w:sz w:val="19"/>
+                <w:sz w:val="18"/>
               </w:rPr>
               <w:t>항목</w:t>
             </w:r>
@@ -410,7 +413,7 @@
         </w:tc>
         <w:tc>
           <w:tcPr>
-            <w:tcW w:type="dxa" w:w="4320"/>
+            <w:tcW w:type="dxa" w:w="5040"/>
             <w:vAlign w:val="center"/>
             <w:shd w:fill="D9EAF7"/>
           </w:tcPr>
@@ -420,7 +423,7 @@
               <w:rPr>
                 <w:rFonts w:ascii="맑은 고딕" w:hAnsi="맑은 고딕" w:eastAsia="맑은 고딕"/>
                 <w:b/>
-                <w:sz w:val="19"/>
+                <w:sz w:val="18"/>
               </w:rPr>
               <w:t>내용</w:t>
             </w:r>
@@ -430,7 +433,7 @@
       <w:tr>
         <w:tc>
           <w:tcPr>
-            <w:tcW w:type="dxa" w:w="4320"/>
+            <w:tcW w:type="dxa" w:w="5040"/>
             <w:vAlign w:val="center"/>
           </w:tcPr>
           <w:p>
@@ -439,7 +442,7 @@
               <w:rPr>
                 <w:rFonts w:ascii="맑은 고딕" w:hAnsi="맑은 고딕" w:eastAsia="맑은 고딕"/>
                 <w:b w:val="0"/>
-                <w:sz w:val="19"/>
+                <w:sz w:val="18"/>
               </w:rPr>
               <w:t>데이터셋</w:t>
             </w:r>
@@ -447,7 +450,7 @@
         </w:tc>
         <w:tc>
           <w:tcPr>
-            <w:tcW w:type="dxa" w:w="4320"/>
+            <w:tcW w:type="dxa" w:w="5040"/>
             <w:vAlign w:val="center"/>
           </w:tcPr>
           <w:p>
@@ -456,7 +459,7 @@
               <w:rPr>
                 <w:rFonts w:ascii="맑은 고딕" w:hAnsi="맑은 고딕" w:eastAsia="맑은 고딕"/>
                 <w:b w:val="0"/>
-                <w:sz w:val="19"/>
+                <w:sz w:val="18"/>
               </w:rPr>
               <w:t>Auto MPG Dataset</w:t>
             </w:r>
@@ -466,7 +469,7 @@
       <w:tr>
         <w:tc>
           <w:tcPr>
-            <w:tcW w:type="dxa" w:w="4320"/>
+            <w:tcW w:type="dxa" w:w="5040"/>
             <w:vAlign w:val="center"/>
           </w:tcPr>
           <w:p>
@@ -475,7 +478,7 @@
               <w:rPr>
                 <w:rFonts w:ascii="맑은 고딕" w:hAnsi="맑은 고딕" w:eastAsia="맑은 고딕"/>
                 <w:b w:val="0"/>
-                <w:sz w:val="19"/>
+                <w:sz w:val="18"/>
               </w:rPr>
               <w:t>데이터 개수</w:t>
             </w:r>
@@ -483,7 +486,7 @@
         </w:tc>
         <w:tc>
           <w:tcPr>
-            <w:tcW w:type="dxa" w:w="4320"/>
+            <w:tcW w:type="dxa" w:w="5040"/>
             <w:vAlign w:val="center"/>
           </w:tcPr>
           <w:p>
@@ -492,7 +495,7 @@
               <w:rPr>
                 <w:rFonts w:ascii="맑은 고딕" w:hAnsi="맑은 고딕" w:eastAsia="맑은 고딕"/>
                 <w:b w:val="0"/>
-                <w:sz w:val="19"/>
+                <w:sz w:val="18"/>
               </w:rPr>
               <w:t>392개</w:t>
             </w:r>
@@ -502,7 +505,7 @@
       <w:tr>
         <w:tc>
           <w:tcPr>
-            <w:tcW w:type="dxa" w:w="4320"/>
+            <w:tcW w:type="dxa" w:w="5040"/>
             <w:vAlign w:val="center"/>
           </w:tcPr>
           <w:p>
@@ -511,7 +514,7 @@
               <w:rPr>
                 <w:rFonts w:ascii="맑은 고딕" w:hAnsi="맑은 고딕" w:eastAsia="맑은 고딕"/>
                 <w:b w:val="0"/>
-                <w:sz w:val="19"/>
+                <w:sz w:val="18"/>
               </w:rPr>
               <w:t>예측 대상</w:t>
             </w:r>
@@ -519,7 +522,7 @@
         </w:tc>
         <w:tc>
           <w:tcPr>
-            <w:tcW w:type="dxa" w:w="4320"/>
+            <w:tcW w:type="dxa" w:w="5040"/>
             <w:vAlign w:val="center"/>
           </w:tcPr>
           <w:p>
@@ -528,7 +531,7 @@
               <w:rPr>
                 <w:rFonts w:ascii="맑은 고딕" w:hAnsi="맑은 고딕" w:eastAsia="맑은 고딕"/>
                 <w:b w:val="0"/>
-                <w:sz w:val="19"/>
+                <w:sz w:val="18"/>
               </w:rPr>
               <w:t>mpg: 자동차 연비</w:t>
             </w:r>
@@ -538,7 +541,7 @@
       <w:tr>
         <w:tc>
           <w:tcPr>
-            <w:tcW w:type="dxa" w:w="4320"/>
+            <w:tcW w:type="dxa" w:w="5040"/>
             <w:vAlign w:val="center"/>
           </w:tcPr>
           <w:p>
@@ -547,7 +550,7 @@
               <w:rPr>
                 <w:rFonts w:ascii="맑은 고딕" w:hAnsi="맑은 고딕" w:eastAsia="맑은 고딕"/>
                 <w:b w:val="0"/>
-                <w:sz w:val="19"/>
+                <w:sz w:val="18"/>
               </w:rPr>
               <w:t>입력 변수</w:t>
             </w:r>
@@ -555,7 +558,7 @@
         </w:tc>
         <w:tc>
           <w:tcPr>
-            <w:tcW w:type="dxa" w:w="4320"/>
+            <w:tcW w:type="dxa" w:w="5040"/>
             <w:vAlign w:val="center"/>
           </w:tcPr>
           <w:p>
@@ -564,7 +567,7 @@
               <w:rPr>
                 <w:rFonts w:ascii="맑은 고딕" w:hAnsi="맑은 고딕" w:eastAsia="맑은 고딕"/>
                 <w:b w:val="0"/>
-                <w:sz w:val="19"/>
+                <w:sz w:val="18"/>
               </w:rPr>
               <w:t>cylinders, displacement, horsepower, weight, acceleration, model_year</w:t>
             </w:r>
@@ -574,7 +577,7 @@
       <w:tr>
         <w:tc>
           <w:tcPr>
-            <w:tcW w:type="dxa" w:w="4320"/>
+            <w:tcW w:type="dxa" w:w="5040"/>
             <w:vAlign w:val="center"/>
           </w:tcPr>
           <w:p>
@@ -583,7 +586,7 @@
               <w:rPr>
                 <w:rFonts w:ascii="맑은 고딕" w:hAnsi="맑은 고딕" w:eastAsia="맑은 고딕"/>
                 <w:b w:val="0"/>
-                <w:sz w:val="19"/>
+                <w:sz w:val="18"/>
               </w:rPr>
               <w:t>학습/테스트 분리</w:t>
             </w:r>
@@ -591,7 +594,7 @@
         </w:tc>
         <w:tc>
           <w:tcPr>
-            <w:tcW w:type="dxa" w:w="4320"/>
+            <w:tcW w:type="dxa" w:w="5040"/>
             <w:vAlign w:val="center"/>
           </w:tcPr>
           <w:p>
@@ -600,7 +603,7 @@
               <w:rPr>
                 <w:rFonts w:ascii="맑은 고딕" w:hAnsi="맑은 고딕" w:eastAsia="맑은 고딕"/>
                 <w:b w:val="0"/>
-                <w:sz w:val="19"/>
+                <w:sz w:val="18"/>
               </w:rPr>
               <w:t>학습 313개, 테스트 79개</w:t>
             </w:r>
@@ -617,15 +620,15 @@
         <w:tblLook w:firstColumn="1" w:firstRow="1" w:lastColumn="0" w:lastRow="0" w:noHBand="0" w:noVBand="1" w:val="04A0"/>
       </w:tblPr>
       <w:tblGrid>
-        <w:gridCol w:w="2160"/>
-        <w:gridCol w:w="2160"/>
-        <w:gridCol w:w="2160"/>
-        <w:gridCol w:w="2160"/>
+        <w:gridCol w:w="2520"/>
+        <w:gridCol w:w="2520"/>
+        <w:gridCol w:w="2520"/>
+        <w:gridCol w:w="2520"/>
       </w:tblGrid>
       <w:tr>
         <w:tc>
           <w:tcPr>
-            <w:tcW w:type="dxa" w:w="2160"/>
+            <w:tcW w:type="dxa" w:w="2520"/>
             <w:vAlign w:val="center"/>
             <w:shd w:fill="D9EAF7"/>
           </w:tcPr>
@@ -635,7 +638,7 @@
               <w:rPr>
                 <w:rFonts w:ascii="맑은 고딕" w:hAnsi="맑은 고딕" w:eastAsia="맑은 고딕"/>
                 <w:b/>
-                <w:sz w:val="19"/>
+                <w:sz w:val="18"/>
               </w:rPr>
               <w:t>변수</w:t>
             </w:r>
@@ -643,7 +646,7 @@
         </w:tc>
         <w:tc>
           <w:tcPr>
-            <w:tcW w:type="dxa" w:w="2160"/>
+            <w:tcW w:type="dxa" w:w="2520"/>
             <w:vAlign w:val="center"/>
             <w:shd w:fill="D9EAF7"/>
           </w:tcPr>
@@ -653,7 +656,7 @@
               <w:rPr>
                 <w:rFonts w:ascii="맑은 고딕" w:hAnsi="맑은 고딕" w:eastAsia="맑은 고딕"/>
                 <w:b/>
-                <w:sz w:val="19"/>
+                <w:sz w:val="18"/>
               </w:rPr>
               <w:t>평균</w:t>
             </w:r>
@@ -661,7 +664,7 @@
         </w:tc>
         <w:tc>
           <w:tcPr>
-            <w:tcW w:type="dxa" w:w="2160"/>
+            <w:tcW w:type="dxa" w:w="2520"/>
             <w:vAlign w:val="center"/>
             <w:shd w:fill="D9EAF7"/>
           </w:tcPr>
@@ -671,7 +674,7 @@
               <w:rPr>
                 <w:rFonts w:ascii="맑은 고딕" w:hAnsi="맑은 고딕" w:eastAsia="맑은 고딕"/>
                 <w:b/>
-                <w:sz w:val="19"/>
+                <w:sz w:val="18"/>
               </w:rPr>
               <w:t>최소</w:t>
             </w:r>
@@ -679,7 +682,7 @@
         </w:tc>
         <w:tc>
           <w:tcPr>
-            <w:tcW w:type="dxa" w:w="2160"/>
+            <w:tcW w:type="dxa" w:w="2520"/>
             <w:vAlign w:val="center"/>
             <w:shd w:fill="D9EAF7"/>
           </w:tcPr>
@@ -689,7 +692,7 @@
               <w:rPr>
                 <w:rFonts w:ascii="맑은 고딕" w:hAnsi="맑은 고딕" w:eastAsia="맑은 고딕"/>
                 <w:b/>
-                <w:sz w:val="19"/>
+                <w:sz w:val="18"/>
               </w:rPr>
               <w:t>최대</w:t>
             </w:r>
@@ -699,7 +702,7 @@
       <w:tr>
         <w:tc>
           <w:tcPr>
-            <w:tcW w:type="dxa" w:w="2160"/>
+            <w:tcW w:type="dxa" w:w="2520"/>
             <w:vAlign w:val="center"/>
           </w:tcPr>
           <w:p>
@@ -708,15 +711,15 @@
               <w:rPr>
                 <w:rFonts w:ascii="맑은 고딕" w:hAnsi="맑은 고딕" w:eastAsia="맑은 고딕"/>
                 <w:b w:val="0"/>
-                <w:sz w:val="19"/>
+                <w:sz w:val="18"/>
               </w:rPr>
-              <w:t>연비</w:t>
+              <w:t>연비(MPG)</w:t>
             </w:r>
           </w:p>
         </w:tc>
         <w:tc>
           <w:tcPr>
-            <w:tcW w:type="dxa" w:w="2160"/>
+            <w:tcW w:type="dxa" w:w="2520"/>
             <w:vAlign w:val="center"/>
           </w:tcPr>
           <w:p>
@@ -725,7 +728,7 @@
               <w:rPr>
                 <w:rFonts w:ascii="맑은 고딕" w:hAnsi="맑은 고딕" w:eastAsia="맑은 고딕"/>
                 <w:b w:val="0"/>
-                <w:sz w:val="19"/>
+                <w:sz w:val="18"/>
               </w:rPr>
               <w:t>23.45</w:t>
             </w:r>
@@ -733,7 +736,7 @@
         </w:tc>
         <w:tc>
           <w:tcPr>
-            <w:tcW w:type="dxa" w:w="2160"/>
+            <w:tcW w:type="dxa" w:w="2520"/>
             <w:vAlign w:val="center"/>
           </w:tcPr>
           <w:p>
@@ -742,7 +745,7 @@
               <w:rPr>
                 <w:rFonts w:ascii="맑은 고딕" w:hAnsi="맑은 고딕" w:eastAsia="맑은 고딕"/>
                 <w:b w:val="0"/>
-                <w:sz w:val="19"/>
+                <w:sz w:val="18"/>
               </w:rPr>
               <w:t>9.00</w:t>
             </w:r>
@@ -750,7 +753,7 @@
         </w:tc>
         <w:tc>
           <w:tcPr>
-            <w:tcW w:type="dxa" w:w="2160"/>
+            <w:tcW w:type="dxa" w:w="2520"/>
             <w:vAlign w:val="center"/>
           </w:tcPr>
           <w:p>
@@ -759,7 +762,7 @@
               <w:rPr>
                 <w:rFonts w:ascii="맑은 고딕" w:hAnsi="맑은 고딕" w:eastAsia="맑은 고딕"/>
                 <w:b w:val="0"/>
-                <w:sz w:val="19"/>
+                <w:sz w:val="18"/>
               </w:rPr>
               <w:t>46.60</w:t>
             </w:r>
@@ -769,7 +772,7 @@
       <w:tr>
         <w:tc>
           <w:tcPr>
-            <w:tcW w:type="dxa" w:w="2160"/>
+            <w:tcW w:type="dxa" w:w="2520"/>
             <w:vAlign w:val="center"/>
           </w:tcPr>
           <w:p>
@@ -778,7 +781,7 @@
               <w:rPr>
                 <w:rFonts w:ascii="맑은 고딕" w:hAnsi="맑은 고딕" w:eastAsia="맑은 고딕"/>
                 <w:b w:val="0"/>
-                <w:sz w:val="19"/>
+                <w:sz w:val="18"/>
               </w:rPr>
               <w:t>실린더 수</w:t>
             </w:r>
@@ -786,7 +789,7 @@
         </w:tc>
         <w:tc>
           <w:tcPr>
-            <w:tcW w:type="dxa" w:w="2160"/>
+            <w:tcW w:type="dxa" w:w="2520"/>
             <w:vAlign w:val="center"/>
           </w:tcPr>
           <w:p>
@@ -795,7 +798,7 @@
               <w:rPr>
                 <w:rFonts w:ascii="맑은 고딕" w:hAnsi="맑은 고딕" w:eastAsia="맑은 고딕"/>
                 <w:b w:val="0"/>
-                <w:sz w:val="19"/>
+                <w:sz w:val="18"/>
               </w:rPr>
               <w:t>5.47</w:t>
             </w:r>
@@ -803,7 +806,7 @@
         </w:tc>
         <w:tc>
           <w:tcPr>
-            <w:tcW w:type="dxa" w:w="2160"/>
+            <w:tcW w:type="dxa" w:w="2520"/>
             <w:vAlign w:val="center"/>
           </w:tcPr>
           <w:p>
@@ -812,7 +815,7 @@
               <w:rPr>
                 <w:rFonts w:ascii="맑은 고딕" w:hAnsi="맑은 고딕" w:eastAsia="맑은 고딕"/>
                 <w:b w:val="0"/>
-                <w:sz w:val="19"/>
+                <w:sz w:val="18"/>
               </w:rPr>
               <w:t>3.00</w:t>
             </w:r>
@@ -820,7 +823,7 @@
         </w:tc>
         <w:tc>
           <w:tcPr>
-            <w:tcW w:type="dxa" w:w="2160"/>
+            <w:tcW w:type="dxa" w:w="2520"/>
             <w:vAlign w:val="center"/>
           </w:tcPr>
           <w:p>
@@ -829,7 +832,7 @@
               <w:rPr>
                 <w:rFonts w:ascii="맑은 고딕" w:hAnsi="맑은 고딕" w:eastAsia="맑은 고딕"/>
                 <w:b w:val="0"/>
-                <w:sz w:val="19"/>
+                <w:sz w:val="18"/>
               </w:rPr>
               <w:t>8.00</w:t>
             </w:r>
@@ -839,7 +842,7 @@
       <w:tr>
         <w:tc>
           <w:tcPr>
-            <w:tcW w:type="dxa" w:w="2160"/>
+            <w:tcW w:type="dxa" w:w="2520"/>
             <w:vAlign w:val="center"/>
           </w:tcPr>
           <w:p>
@@ -848,7 +851,7 @@
               <w:rPr>
                 <w:rFonts w:ascii="맑은 고딕" w:hAnsi="맑은 고딕" w:eastAsia="맑은 고딕"/>
                 <w:b w:val="0"/>
-                <w:sz w:val="19"/>
+                <w:sz w:val="18"/>
               </w:rPr>
               <w:t>배기량</w:t>
             </w:r>
@@ -856,7 +859,7 @@
         </w:tc>
         <w:tc>
           <w:tcPr>
-            <w:tcW w:type="dxa" w:w="2160"/>
+            <w:tcW w:type="dxa" w:w="2520"/>
             <w:vAlign w:val="center"/>
           </w:tcPr>
           <w:p>
@@ -865,7 +868,7 @@
               <w:rPr>
                 <w:rFonts w:ascii="맑은 고딕" w:hAnsi="맑은 고딕" w:eastAsia="맑은 고딕"/>
                 <w:b w:val="0"/>
-                <w:sz w:val="19"/>
+                <w:sz w:val="18"/>
               </w:rPr>
               <w:t>194.41</w:t>
             </w:r>
@@ -873,7 +876,7 @@
         </w:tc>
         <w:tc>
           <w:tcPr>
-            <w:tcW w:type="dxa" w:w="2160"/>
+            <w:tcW w:type="dxa" w:w="2520"/>
             <w:vAlign w:val="center"/>
           </w:tcPr>
           <w:p>
@@ -882,7 +885,7 @@
               <w:rPr>
                 <w:rFonts w:ascii="맑은 고딕" w:hAnsi="맑은 고딕" w:eastAsia="맑은 고딕"/>
                 <w:b w:val="0"/>
-                <w:sz w:val="19"/>
+                <w:sz w:val="18"/>
               </w:rPr>
               <w:t>68.00</w:t>
             </w:r>
@@ -890,7 +893,7 @@
         </w:tc>
         <w:tc>
           <w:tcPr>
-            <w:tcW w:type="dxa" w:w="2160"/>
+            <w:tcW w:type="dxa" w:w="2520"/>
             <w:vAlign w:val="center"/>
           </w:tcPr>
           <w:p>
@@ -899,7 +902,7 @@
               <w:rPr>
                 <w:rFonts w:ascii="맑은 고딕" w:hAnsi="맑은 고딕" w:eastAsia="맑은 고딕"/>
                 <w:b w:val="0"/>
-                <w:sz w:val="19"/>
+                <w:sz w:val="18"/>
               </w:rPr>
               <w:t>455.00</w:t>
             </w:r>
@@ -909,7 +912,7 @@
       <w:tr>
         <w:tc>
           <w:tcPr>
-            <w:tcW w:type="dxa" w:w="2160"/>
+            <w:tcW w:type="dxa" w:w="2520"/>
             <w:vAlign w:val="center"/>
           </w:tcPr>
           <w:p>
@@ -918,7 +921,7 @@
               <w:rPr>
                 <w:rFonts w:ascii="맑은 고딕" w:hAnsi="맑은 고딕" w:eastAsia="맑은 고딕"/>
                 <w:b w:val="0"/>
-                <w:sz w:val="19"/>
+                <w:sz w:val="18"/>
               </w:rPr>
               <w:t>마력</w:t>
             </w:r>
@@ -926,7 +929,7 @@
         </w:tc>
         <w:tc>
           <w:tcPr>
-            <w:tcW w:type="dxa" w:w="2160"/>
+            <w:tcW w:type="dxa" w:w="2520"/>
             <w:vAlign w:val="center"/>
           </w:tcPr>
           <w:p>
@@ -935,7 +938,7 @@
               <w:rPr>
                 <w:rFonts w:ascii="맑은 고딕" w:hAnsi="맑은 고딕" w:eastAsia="맑은 고딕"/>
                 <w:b w:val="0"/>
-                <w:sz w:val="19"/>
+                <w:sz w:val="18"/>
               </w:rPr>
               <w:t>104.47</w:t>
             </w:r>
@@ -943,7 +946,7 @@
         </w:tc>
         <w:tc>
           <w:tcPr>
-            <w:tcW w:type="dxa" w:w="2160"/>
+            <w:tcW w:type="dxa" w:w="2520"/>
             <w:vAlign w:val="center"/>
           </w:tcPr>
           <w:p>
@@ -952,7 +955,7 @@
               <w:rPr>
                 <w:rFonts w:ascii="맑은 고딕" w:hAnsi="맑은 고딕" w:eastAsia="맑은 고딕"/>
                 <w:b w:val="0"/>
-                <w:sz w:val="19"/>
+                <w:sz w:val="18"/>
               </w:rPr>
               <w:t>46.00</w:t>
             </w:r>
@@ -960,7 +963,7 @@
         </w:tc>
         <w:tc>
           <w:tcPr>
-            <w:tcW w:type="dxa" w:w="2160"/>
+            <w:tcW w:type="dxa" w:w="2520"/>
             <w:vAlign w:val="center"/>
           </w:tcPr>
           <w:p>
@@ -969,7 +972,7 @@
               <w:rPr>
                 <w:rFonts w:ascii="맑은 고딕" w:hAnsi="맑은 고딕" w:eastAsia="맑은 고딕"/>
                 <w:b w:val="0"/>
-                <w:sz w:val="19"/>
+                <w:sz w:val="18"/>
               </w:rPr>
               <w:t>230.00</w:t>
             </w:r>
@@ -979,7 +982,7 @@
       <w:tr>
         <w:tc>
           <w:tcPr>
-            <w:tcW w:type="dxa" w:w="2160"/>
+            <w:tcW w:type="dxa" w:w="2520"/>
             <w:vAlign w:val="center"/>
           </w:tcPr>
           <w:p>
@@ -988,7 +991,7 @@
               <w:rPr>
                 <w:rFonts w:ascii="맑은 고딕" w:hAnsi="맑은 고딕" w:eastAsia="맑은 고딕"/>
                 <w:b w:val="0"/>
-                <w:sz w:val="19"/>
+                <w:sz w:val="18"/>
               </w:rPr>
               <w:t>무게</w:t>
             </w:r>
@@ -996,7 +999,7 @@
         </w:tc>
         <w:tc>
           <w:tcPr>
-            <w:tcW w:type="dxa" w:w="2160"/>
+            <w:tcW w:type="dxa" w:w="2520"/>
             <w:vAlign w:val="center"/>
           </w:tcPr>
           <w:p>
@@ -1005,7 +1008,7 @@
               <w:rPr>
                 <w:rFonts w:ascii="맑은 고딕" w:hAnsi="맑은 고딕" w:eastAsia="맑은 고딕"/>
                 <w:b w:val="0"/>
-                <w:sz w:val="19"/>
+                <w:sz w:val="18"/>
               </w:rPr>
               <w:t>2977.58</w:t>
             </w:r>
@@ -1013,7 +1016,7 @@
         </w:tc>
         <w:tc>
           <w:tcPr>
-            <w:tcW w:type="dxa" w:w="2160"/>
+            <w:tcW w:type="dxa" w:w="2520"/>
             <w:vAlign w:val="center"/>
           </w:tcPr>
           <w:p>
@@ -1022,7 +1025,7 @@
               <w:rPr>
                 <w:rFonts w:ascii="맑은 고딕" w:hAnsi="맑은 고딕" w:eastAsia="맑은 고딕"/>
                 <w:b w:val="0"/>
-                <w:sz w:val="19"/>
+                <w:sz w:val="18"/>
               </w:rPr>
               <w:t>1613.00</w:t>
             </w:r>
@@ -1030,7 +1033,7 @@
         </w:tc>
         <w:tc>
           <w:tcPr>
-            <w:tcW w:type="dxa" w:w="2160"/>
+            <w:tcW w:type="dxa" w:w="2520"/>
             <w:vAlign w:val="center"/>
           </w:tcPr>
           <w:p>
@@ -1039,7 +1042,7 @@
               <w:rPr>
                 <w:rFonts w:ascii="맑은 고딕" w:hAnsi="맑은 고딕" w:eastAsia="맑은 고딕"/>
                 <w:b w:val="0"/>
-                <w:sz w:val="19"/>
+                <w:sz w:val="18"/>
               </w:rPr>
               <w:t>5140.00</w:t>
             </w:r>
@@ -1049,7 +1052,7 @@
       <w:tr>
         <w:tc>
           <w:tcPr>
-            <w:tcW w:type="dxa" w:w="2160"/>
+            <w:tcW w:type="dxa" w:w="2520"/>
             <w:vAlign w:val="center"/>
           </w:tcPr>
           <w:p>
@@ -1058,7 +1061,7 @@
               <w:rPr>
                 <w:rFonts w:ascii="맑은 고딕" w:hAnsi="맑은 고딕" w:eastAsia="맑은 고딕"/>
                 <w:b w:val="0"/>
-                <w:sz w:val="19"/>
+                <w:sz w:val="18"/>
               </w:rPr>
               <w:t>가속력</w:t>
             </w:r>
@@ -1066,7 +1069,7 @@
         </w:tc>
         <w:tc>
           <w:tcPr>
-            <w:tcW w:type="dxa" w:w="2160"/>
+            <w:tcW w:type="dxa" w:w="2520"/>
             <w:vAlign w:val="center"/>
           </w:tcPr>
           <w:p>
@@ -1075,7 +1078,7 @@
               <w:rPr>
                 <w:rFonts w:ascii="맑은 고딕" w:hAnsi="맑은 고딕" w:eastAsia="맑은 고딕"/>
                 <w:b w:val="0"/>
-                <w:sz w:val="19"/>
+                <w:sz w:val="18"/>
               </w:rPr>
               <w:t>15.54</w:t>
             </w:r>
@@ -1083,7 +1086,7 @@
         </w:tc>
         <w:tc>
           <w:tcPr>
-            <w:tcW w:type="dxa" w:w="2160"/>
+            <w:tcW w:type="dxa" w:w="2520"/>
             <w:vAlign w:val="center"/>
           </w:tcPr>
           <w:p>
@@ -1092,7 +1095,7 @@
               <w:rPr>
                 <w:rFonts w:ascii="맑은 고딕" w:hAnsi="맑은 고딕" w:eastAsia="맑은 고딕"/>
                 <w:b w:val="0"/>
-                <w:sz w:val="19"/>
+                <w:sz w:val="18"/>
               </w:rPr>
               <w:t>8.00</w:t>
             </w:r>
@@ -1100,7 +1103,7 @@
         </w:tc>
         <w:tc>
           <w:tcPr>
-            <w:tcW w:type="dxa" w:w="2160"/>
+            <w:tcW w:type="dxa" w:w="2520"/>
             <w:vAlign w:val="center"/>
           </w:tcPr>
           <w:p>
@@ -1109,7 +1112,7 @@
               <w:rPr>
                 <w:rFonts w:ascii="맑은 고딕" w:hAnsi="맑은 고딕" w:eastAsia="맑은 고딕"/>
                 <w:b w:val="0"/>
-                <w:sz w:val="19"/>
+                <w:sz w:val="18"/>
               </w:rPr>
               <w:t>24.80</w:t>
             </w:r>
@@ -1119,7 +1122,7 @@
       <w:tr>
         <w:tc>
           <w:tcPr>
-            <w:tcW w:type="dxa" w:w="2160"/>
+            <w:tcW w:type="dxa" w:w="2520"/>
             <w:vAlign w:val="center"/>
           </w:tcPr>
           <w:p>
@@ -1128,7 +1131,7 @@
               <w:rPr>
                 <w:rFonts w:ascii="맑은 고딕" w:hAnsi="맑은 고딕" w:eastAsia="맑은 고딕"/>
                 <w:b w:val="0"/>
-                <w:sz w:val="19"/>
+                <w:sz w:val="18"/>
               </w:rPr>
               <w:t>연식</w:t>
             </w:r>
@@ -1136,7 +1139,7 @@
         </w:tc>
         <w:tc>
           <w:tcPr>
-            <w:tcW w:type="dxa" w:w="2160"/>
+            <w:tcW w:type="dxa" w:w="2520"/>
             <w:vAlign w:val="center"/>
           </w:tcPr>
           <w:p>
@@ -1145,7 +1148,7 @@
               <w:rPr>
                 <w:rFonts w:ascii="맑은 고딕" w:hAnsi="맑은 고딕" w:eastAsia="맑은 고딕"/>
                 <w:b w:val="0"/>
-                <w:sz w:val="19"/>
+                <w:sz w:val="18"/>
               </w:rPr>
               <w:t>75.98</w:t>
             </w:r>
@@ -1153,7 +1156,7 @@
         </w:tc>
         <w:tc>
           <w:tcPr>
-            <w:tcW w:type="dxa" w:w="2160"/>
+            <w:tcW w:type="dxa" w:w="2520"/>
             <w:vAlign w:val="center"/>
           </w:tcPr>
           <w:p>
@@ -1162,7 +1165,7 @@
               <w:rPr>
                 <w:rFonts w:ascii="맑은 고딕" w:hAnsi="맑은 고딕" w:eastAsia="맑은 고딕"/>
                 <w:b w:val="0"/>
-                <w:sz w:val="19"/>
+                <w:sz w:val="18"/>
               </w:rPr>
               <w:t>70.00</w:t>
             </w:r>
@@ -1170,7 +1173,7 @@
         </w:tc>
         <w:tc>
           <w:tcPr>
-            <w:tcW w:type="dxa" w:w="2160"/>
+            <w:tcW w:type="dxa" w:w="2520"/>
             <w:vAlign w:val="center"/>
           </w:tcPr>
           <w:p>
@@ -1179,9 +1182,368 @@
               <w:rPr>
                 <w:rFonts w:ascii="맑은 고딕" w:hAnsi="맑은 고딕" w:eastAsia="맑은 고딕"/>
                 <w:b w:val="0"/>
-                <w:sz w:val="19"/>
+                <w:sz w:val="18"/>
               </w:rPr>
               <w:t>82.00</w:t>
+            </w:r>
+          </w:p>
+        </w:tc>
+      </w:tr>
+    </w:tbl>
+    <w:p/>
+    <w:p>
+      <w:pPr>
+        <w:jc w:val="center"/>
+      </w:pPr>
+      <w:r>
+        <w:drawing>
+          <wp:inline xmlns:a="http://schemas.openxmlformats.org/drawingml/2006/main" xmlns:pic="http://schemas.openxmlformats.org/drawingml/2006/picture">
+            <wp:extent cx="5394960" cy="3147060"/>
+            <wp:docPr id="1" name="Picture 1"/>
+            <wp:cNvGraphicFramePr>
+              <a:graphicFrameLocks noChangeAspect="1"/>
+            </wp:cNvGraphicFramePr>
+            <a:graphic>
+              <a:graphicData uri="http://schemas.openxmlformats.org/drawingml/2006/picture">
+                <pic:pic>
+                  <pic:nvPicPr>
+                    <pic:cNvPr id="0" name="final_mpg_distribution.png"/>
+                    <pic:cNvPicPr/>
+                  </pic:nvPicPr>
+                  <pic:blipFill>
+                    <a:blip r:embed="rId9"/>
+                    <a:stretch>
+                      <a:fillRect/>
+                    </a:stretch>
+                  </pic:blipFill>
+                  <pic:spPr>
+                    <a:xfrm>
+                      <a:off x="0" y="0"/>
+                      <a:ext cx="5394960" cy="3147060"/>
+                    </a:xfrm>
+                    <a:prstGeom prst="rect"/>
+                  </pic:spPr>
+                </pic:pic>
+              </a:graphicData>
+            </a:graphic>
+          </wp:inline>
+        </w:drawing>
+      </w:r>
+    </w:p>
+    <w:p>
+      <w:pPr>
+        <w:jc w:val="center"/>
+      </w:pPr>
+      <w:r>
+        <w:rPr>
+          <w:rFonts w:ascii="맑은 고딕" w:hAnsi="맑은 고딕" w:eastAsia="맑은 고딕"/>
+          <w:b w:val="0"/>
+          <w:color w:val="4D5F78"/>
+          <w:sz w:val="18"/>
+        </w:rPr>
+        <w:t>그림 1. 자동차 연비(MPG) 분포</w:t>
+      </w:r>
+    </w:p>
+    <w:p>
+      <w:pPr>
+        <w:spacing w:line="324" w:lineRule="auto"/>
+      </w:pPr>
+      <w:r>
+        <w:rPr>
+          <w:rFonts w:ascii="맑은 고딕" w:hAnsi="맑은 고딕" w:eastAsia="맑은 고딕"/>
+          <w:b w:val="0"/>
+          <w:sz w:val="21"/>
+        </w:rPr>
+        <w:t>연비 분포 그래프를 보면 대부분의 차량이 중간 연비 구간에 몰려 있다. 데이터의 범위와 집중 구간을 확인하면 모델이 어떤 값의 예측을 많이 학습하게 되는지 이해할 수 있다.</w:t>
+      </w:r>
+    </w:p>
+    <w:p>
+      <w:pPr>
+        <w:jc w:val="center"/>
+      </w:pPr>
+      <w:r>
+        <w:drawing>
+          <wp:inline xmlns:a="http://schemas.openxmlformats.org/drawingml/2006/main" xmlns:pic="http://schemas.openxmlformats.org/drawingml/2006/picture">
+            <wp:extent cx="5394960" cy="4121150"/>
+            <wp:docPr id="2" name="Picture 2"/>
+            <wp:cNvGraphicFramePr>
+              <a:graphicFrameLocks noChangeAspect="1"/>
+            </wp:cNvGraphicFramePr>
+            <a:graphic>
+              <a:graphicData uri="http://schemas.openxmlformats.org/drawingml/2006/picture">
+                <pic:pic>
+                  <pic:nvPicPr>
+                    <pic:cNvPr id="0" name="final_correlation_heatmap.png"/>
+                    <pic:cNvPicPr/>
+                  </pic:nvPicPr>
+                  <pic:blipFill>
+                    <a:blip r:embed="rId10"/>
+                    <a:stretch>
+                      <a:fillRect/>
+                    </a:stretch>
+                  </pic:blipFill>
+                  <pic:spPr>
+                    <a:xfrm>
+                      <a:off x="0" y="0"/>
+                      <a:ext cx="5394960" cy="4121150"/>
+                    </a:xfrm>
+                    <a:prstGeom prst="rect"/>
+                  </pic:spPr>
+                </pic:pic>
+              </a:graphicData>
+            </a:graphic>
+          </wp:inline>
+        </w:drawing>
+      </w:r>
+    </w:p>
+    <w:p>
+      <w:pPr>
+        <w:jc w:val="center"/>
+      </w:pPr>
+      <w:r>
+        <w:rPr>
+          <w:rFonts w:ascii="맑은 고딕" w:hAnsi="맑은 고딕" w:eastAsia="맑은 고딕"/>
+          <w:b w:val="0"/>
+          <w:color w:val="4D5F78"/>
+          <w:sz w:val="18"/>
+        </w:rPr>
+        <w:t>그림 2. 입력 변수와 연비 사이의 상관관계</w:t>
+      </w:r>
+    </w:p>
+    <w:p>
+      <w:pPr>
+        <w:spacing w:line="324" w:lineRule="auto"/>
+      </w:pPr>
+      <w:r>
+        <w:rPr>
+          <w:rFonts w:ascii="맑은 고딕" w:hAnsi="맑은 고딕" w:eastAsia="맑은 고딕"/>
+          <w:b w:val="0"/>
+          <w:sz w:val="21"/>
+        </w:rPr>
+        <w:t>상관관계 그래프에서는 무게, 배기량, 마력, 실린더 수가 연비와 음의 상관관계를 보인다. 즉 차량이 무겁거나 엔진 규모가 클수록 MPG가 낮아지는 경향이 나타난다.</w:t>
+      </w:r>
+    </w:p>
+    <w:p>
+      <w:r>
+        <w:br w:type="page"/>
+      </w:r>
+    </w:p>
+    <w:p>
+      <w:pPr>
+        <w:pStyle w:val="Heading1"/>
+      </w:pPr>
+      <w:r>
+        <w:rPr>
+          <w:rFonts w:ascii="맑은 고딕" w:hAnsi="맑은 고딕" w:eastAsia="맑은 고딕"/>
+          <w:b/>
+          <w:color w:val="162033"/>
+          <w:sz w:val="32"/>
+        </w:rPr>
+        <w:t>4. 모델 학습 과정</w:t>
+      </w:r>
+    </w:p>
+    <w:p>
+      <w:pPr>
+        <w:spacing w:line="324" w:lineRule="auto"/>
+      </w:pPr>
+      <w:r>
+        <w:rPr>
+          <w:rFonts w:ascii="맑은 고딕" w:hAnsi="맑은 고딕" w:eastAsia="맑은 고딕"/>
+          <w:b w:val="0"/>
+          <w:sz w:val="21"/>
+        </w:rPr>
+        <w:t>모델 학습은 car_mpg_training.ipynb에서 수행하였다. 수업 범위에 맞추어 선형회귀, 의사결정나무, 랜덤 포레스트, KNN 회귀 4개 모델만 비교하였다.</w:t>
+      </w:r>
+    </w:p>
+    <w:tbl>
+      <w:tblPr>
+        <w:tblStyle w:val="TableGrid"/>
+        <w:tblW w:type="auto" w:w="0"/>
+        <w:jc w:val="center"/>
+        <w:tblLook w:firstColumn="1" w:firstRow="1" w:lastColumn="0" w:lastRow="0" w:noHBand="0" w:noVBand="1" w:val="04A0"/>
+      </w:tblPr>
+      <w:tblGrid>
+        <w:gridCol w:w="5040"/>
+        <w:gridCol w:w="5040"/>
+      </w:tblGrid>
+      <w:tr>
+        <w:tc>
+          <w:tcPr>
+            <w:tcW w:type="dxa" w:w="5040"/>
+            <w:vAlign w:val="center"/>
+            <w:shd w:fill="D9EAF7"/>
+          </w:tcPr>
+          <w:p>
+            <w:r/>
+            <w:r>
+              <w:rPr>
+                <w:rFonts w:ascii="맑은 고딕" w:hAnsi="맑은 고딕" w:eastAsia="맑은 고딕"/>
+                <w:b/>
+                <w:sz w:val="18"/>
+              </w:rPr>
+              <w:t>모델</w:t>
+            </w:r>
+          </w:p>
+        </w:tc>
+        <w:tc>
+          <w:tcPr>
+            <w:tcW w:type="dxa" w:w="5040"/>
+            <w:vAlign w:val="center"/>
+            <w:shd w:fill="D9EAF7"/>
+          </w:tcPr>
+          <w:p>
+            <w:r/>
+            <w:r>
+              <w:rPr>
+                <w:rFonts w:ascii="맑은 고딕" w:hAnsi="맑은 고딕" w:eastAsia="맑은 고딕"/>
+                <w:b/>
+                <w:sz w:val="18"/>
+              </w:rPr>
+              <w:t>설명</w:t>
+            </w:r>
+          </w:p>
+        </w:tc>
+      </w:tr>
+      <w:tr>
+        <w:tc>
+          <w:tcPr>
+            <w:tcW w:type="dxa" w:w="5040"/>
+            <w:vAlign w:val="center"/>
+          </w:tcPr>
+          <w:p>
+            <w:r/>
+            <w:r>
+              <w:rPr>
+                <w:rFonts w:ascii="맑은 고딕" w:hAnsi="맑은 고딕" w:eastAsia="맑은 고딕"/>
+                <w:b w:val="0"/>
+                <w:sz w:val="18"/>
+              </w:rPr>
+              <w:t>선형회귀</w:t>
+            </w:r>
+          </w:p>
+        </w:tc>
+        <w:tc>
+          <w:tcPr>
+            <w:tcW w:type="dxa" w:w="5040"/>
+            <w:vAlign w:val="center"/>
+          </w:tcPr>
+          <w:p>
+            <w:r/>
+            <w:r>
+              <w:rPr>
+                <w:rFonts w:ascii="맑은 고딕" w:hAnsi="맑은 고딕" w:eastAsia="맑은 고딕"/>
+                <w:b w:val="0"/>
+                <w:sz w:val="18"/>
+              </w:rPr>
+              <w:t>입력 변수와 연비 사이의 선형 관계를 학습하는 기본 회귀 모델</w:t>
+            </w:r>
+          </w:p>
+        </w:tc>
+      </w:tr>
+      <w:tr>
+        <w:tc>
+          <w:tcPr>
+            <w:tcW w:type="dxa" w:w="5040"/>
+            <w:vAlign w:val="center"/>
+          </w:tcPr>
+          <w:p>
+            <w:r/>
+            <w:r>
+              <w:rPr>
+                <w:rFonts w:ascii="맑은 고딕" w:hAnsi="맑은 고딕" w:eastAsia="맑은 고딕"/>
+                <w:b w:val="0"/>
+                <w:sz w:val="18"/>
+              </w:rPr>
+              <w:t>의사결정나무</w:t>
+            </w:r>
+          </w:p>
+        </w:tc>
+        <w:tc>
+          <w:tcPr>
+            <w:tcW w:type="dxa" w:w="5040"/>
+            <w:vAlign w:val="center"/>
+          </w:tcPr>
+          <w:p>
+            <w:r/>
+            <w:r>
+              <w:rPr>
+                <w:rFonts w:ascii="맑은 고딕" w:hAnsi="맑은 고딕" w:eastAsia="맑은 고딕"/>
+                <w:b w:val="0"/>
+                <w:sz w:val="18"/>
+              </w:rPr>
+              <w:t>조건 분기를 통해 데이터를 나누고 예측하는 트리 기반 모델</w:t>
+            </w:r>
+          </w:p>
+        </w:tc>
+      </w:tr>
+      <w:tr>
+        <w:tc>
+          <w:tcPr>
+            <w:tcW w:type="dxa" w:w="5040"/>
+            <w:vAlign w:val="center"/>
+          </w:tcPr>
+          <w:p>
+            <w:r/>
+            <w:r>
+              <w:rPr>
+                <w:rFonts w:ascii="맑은 고딕" w:hAnsi="맑은 고딕" w:eastAsia="맑은 고딕"/>
+                <w:b w:val="0"/>
+                <w:sz w:val="18"/>
+              </w:rPr>
+              <w:t>랜덤 포레스트</w:t>
+            </w:r>
+          </w:p>
+        </w:tc>
+        <w:tc>
+          <w:tcPr>
+            <w:tcW w:type="dxa" w:w="5040"/>
+            <w:vAlign w:val="center"/>
+          </w:tcPr>
+          <w:p>
+            <w:r/>
+            <w:r>
+              <w:rPr>
+                <w:rFonts w:ascii="맑은 고딕" w:hAnsi="맑은 고딕" w:eastAsia="맑은 고딕"/>
+                <w:b w:val="0"/>
+                <w:sz w:val="18"/>
+              </w:rPr>
+              <w:t>여러 개의 결정나무를 함께 사용하여 예측 안정성을 높인 모델</w:t>
+            </w:r>
+          </w:p>
+        </w:tc>
+      </w:tr>
+      <w:tr>
+        <w:tc>
+          <w:tcPr>
+            <w:tcW w:type="dxa" w:w="5040"/>
+            <w:vAlign w:val="center"/>
+          </w:tcPr>
+          <w:p>
+            <w:r/>
+            <w:r>
+              <w:rPr>
+                <w:rFonts w:ascii="맑은 고딕" w:hAnsi="맑은 고딕" w:eastAsia="맑은 고딕"/>
+                <w:b w:val="0"/>
+                <w:sz w:val="18"/>
+              </w:rPr>
+              <w:t>KNN 회귀</w:t>
+            </w:r>
+          </w:p>
+        </w:tc>
+        <w:tc>
+          <w:tcPr>
+            <w:tcW w:type="dxa" w:w="5040"/>
+            <w:vAlign w:val="center"/>
+          </w:tcPr>
+          <w:p>
+            <w:r/>
+            <w:r>
+              <w:rPr>
+                <w:rFonts w:ascii="맑은 고딕" w:hAnsi="맑은 고딕" w:eastAsia="맑은 고딕"/>
+                <w:b w:val="0"/>
+                <w:sz w:val="18"/>
+              </w:rPr>
+              <w:t>입력값과 가까운 이웃 데이터들의 평균을 이용해 예측하는 모델</w:t>
             </w:r>
           </w:p>
         </w:tc>
@@ -1196,9 +1558,10 @@
         <w:rPr>
           <w:rFonts w:ascii="맑은 고딕" w:hAnsi="맑은 고딕" w:eastAsia="맑은 고딕"/>
           <w:b/>
-          <w:sz w:val="36"/>
+          <w:color w:val="162033"/>
+          <w:sz w:val="32"/>
         </w:rPr>
-        <w:t>4. 모델 학습 과정</w:t>
+        <w:t>5. 학습 모델별 성능 비교</w:t>
       </w:r>
     </w:p>
     <w:p>
@@ -1211,7 +1574,7 @@
           <w:b w:val="0"/>
           <w:sz w:val="21"/>
         </w:rPr>
-        <w:t>모델 학습은 car_mpg_training.ipynb에서 수행하였다. 수업에서 다룬 범위에 맞춰 선형회귀, 의사결정나무, 랜덤 포레스트, KNN 회귀 4개 모델을 비교하였다.</w:t>
+        <w:t>모델 성능은 R², MAE, RMSE를 기준으로 비교하였다. RMSE는 예측 오차를 의미하므로 낮을수록 좋고, R²는 모델 설명력을 의미하므로 높을수록 좋다.</w:t>
       </w:r>
     </w:p>
     <w:tbl>
@@ -1222,13 +1585,17 @@
         <w:tblLook w:firstColumn="1" w:firstRow="1" w:lastColumn="0" w:lastRow="0" w:noHBand="0" w:noVBand="1" w:val="04A0"/>
       </w:tblPr>
       <w:tblGrid>
-        <w:gridCol w:w="4320"/>
-        <w:gridCol w:w="4320"/>
+        <w:gridCol w:w="1680"/>
+        <w:gridCol w:w="1680"/>
+        <w:gridCol w:w="1680"/>
+        <w:gridCol w:w="1680"/>
+        <w:gridCol w:w="1680"/>
+        <w:gridCol w:w="1680"/>
       </w:tblGrid>
       <w:tr>
         <w:tc>
           <w:tcPr>
-            <w:tcW w:type="dxa" w:w="4320"/>
+            <w:tcW w:type="dxa" w:w="1680"/>
             <w:vAlign w:val="center"/>
             <w:shd w:fill="D9EAF7"/>
           </w:tcPr>
@@ -1238,15 +1605,15 @@
               <w:rPr>
                 <w:rFonts w:ascii="맑은 고딕" w:hAnsi="맑은 고딕" w:eastAsia="맑은 고딕"/>
                 <w:b/>
-                <w:sz w:val="19"/>
+                <w:sz w:val="18"/>
               </w:rPr>
-              <w:t>모델</w:t>
+              <w:t>순위</w:t>
             </w:r>
           </w:p>
         </w:tc>
         <w:tc>
           <w:tcPr>
-            <w:tcW w:type="dxa" w:w="4320"/>
+            <w:tcW w:type="dxa" w:w="1680"/>
             <w:vAlign w:val="center"/>
             <w:shd w:fill="D9EAF7"/>
           </w:tcPr>
@@ -1256,9 +1623,81 @@
               <w:rPr>
                 <w:rFonts w:ascii="맑은 고딕" w:hAnsi="맑은 고딕" w:eastAsia="맑은 고딕"/>
                 <w:b/>
-                <w:sz w:val="19"/>
+                <w:sz w:val="18"/>
               </w:rPr>
-              <w:t>설명</w:t>
+              <w:t>모델</w:t>
+            </w:r>
+          </w:p>
+        </w:tc>
+        <w:tc>
+          <w:tcPr>
+            <w:tcW w:type="dxa" w:w="1680"/>
+            <w:vAlign w:val="center"/>
+            <w:shd w:fill="D9EAF7"/>
+          </w:tcPr>
+          <w:p>
+            <w:r/>
+            <w:r>
+              <w:rPr>
+                <w:rFonts w:ascii="맑은 고딕" w:hAnsi="맑은 고딕" w:eastAsia="맑은 고딕"/>
+                <w:b/>
+                <w:sz w:val="18"/>
+              </w:rPr>
+              <w:t>R²</w:t>
+            </w:r>
+          </w:p>
+        </w:tc>
+        <w:tc>
+          <w:tcPr>
+            <w:tcW w:type="dxa" w:w="1680"/>
+            <w:vAlign w:val="center"/>
+            <w:shd w:fill="D9EAF7"/>
+          </w:tcPr>
+          <w:p>
+            <w:r/>
+            <w:r>
+              <w:rPr>
+                <w:rFonts w:ascii="맑은 고딕" w:hAnsi="맑은 고딕" w:eastAsia="맑은 고딕"/>
+                <w:b/>
+                <w:sz w:val="18"/>
+              </w:rPr>
+              <w:t>MAE</w:t>
+            </w:r>
+          </w:p>
+        </w:tc>
+        <w:tc>
+          <w:tcPr>
+            <w:tcW w:type="dxa" w:w="1680"/>
+            <w:vAlign w:val="center"/>
+            <w:shd w:fill="D9EAF7"/>
+          </w:tcPr>
+          <w:p>
+            <w:r/>
+            <w:r>
+              <w:rPr>
+                <w:rFonts w:ascii="맑은 고딕" w:hAnsi="맑은 고딕" w:eastAsia="맑은 고딕"/>
+                <w:b/>
+                <w:sz w:val="18"/>
+              </w:rPr>
+              <w:t>RMSE</w:t>
+            </w:r>
+          </w:p>
+        </w:tc>
+        <w:tc>
+          <w:tcPr>
+            <w:tcW w:type="dxa" w:w="1680"/>
+            <w:vAlign w:val="center"/>
+            <w:shd w:fill="D9EAF7"/>
+          </w:tcPr>
+          <w:p>
+            <w:r/>
+            <w:r>
+              <w:rPr>
+                <w:rFonts w:ascii="맑은 고딕" w:hAnsi="맑은 고딕" w:eastAsia="맑은 고딕"/>
+                <w:b/>
+                <w:sz w:val="18"/>
+              </w:rPr>
+              <w:t>선택 여부</w:t>
             </w:r>
           </w:p>
         </w:tc>
@@ -1266,7 +1705,7 @@
       <w:tr>
         <w:tc>
           <w:tcPr>
-            <w:tcW w:type="dxa" w:w="4320"/>
+            <w:tcW w:type="dxa" w:w="1680"/>
             <w:vAlign w:val="center"/>
           </w:tcPr>
           <w:p>
@@ -1275,15 +1714,15 @@
               <w:rPr>
                 <w:rFonts w:ascii="맑은 고딕" w:hAnsi="맑은 고딕" w:eastAsia="맑은 고딕"/>
                 <w:b w:val="0"/>
-                <w:sz w:val="19"/>
+                <w:sz w:val="18"/>
               </w:rPr>
-              <w:t>선형회귀</w:t>
+              <w:t>1</w:t>
             </w:r>
           </w:p>
         </w:tc>
         <w:tc>
           <w:tcPr>
-            <w:tcW w:type="dxa" w:w="4320"/>
+            <w:tcW w:type="dxa" w:w="1680"/>
             <w:vAlign w:val="center"/>
           </w:tcPr>
           <w:p>
@@ -1292,17 +1731,15 @@
               <w:rPr>
                 <w:rFonts w:ascii="맑은 고딕" w:hAnsi="맑은 고딕" w:eastAsia="맑은 고딕"/>
                 <w:b w:val="0"/>
-                <w:sz w:val="19"/>
+                <w:sz w:val="18"/>
               </w:rPr>
-              <w:t>입력 변수와 연비 사이의 선형 관계를 학습하는 기본 회귀 모델</w:t>
+              <w:t>랜덤 포레스트</w:t>
             </w:r>
           </w:p>
         </w:tc>
-      </w:tr>
-      <w:tr>
         <w:tc>
           <w:tcPr>
-            <w:tcW w:type="dxa" w:w="4320"/>
+            <w:tcW w:type="dxa" w:w="1680"/>
             <w:vAlign w:val="center"/>
           </w:tcPr>
           <w:p>
@@ -1311,15 +1748,15 @@
               <w:rPr>
                 <w:rFonts w:ascii="맑은 고딕" w:hAnsi="맑은 고딕" w:eastAsia="맑은 고딕"/>
                 <w:b w:val="0"/>
-                <w:sz w:val="19"/>
+                <w:sz w:val="18"/>
               </w:rPr>
-              <w:t>의사결정나무</w:t>
+              <w:t>0.887</w:t>
             </w:r>
           </w:p>
         </w:tc>
         <w:tc>
           <w:tcPr>
-            <w:tcW w:type="dxa" w:w="4320"/>
+            <w:tcW w:type="dxa" w:w="1680"/>
             <w:vAlign w:val="center"/>
           </w:tcPr>
           <w:p>
@@ -1328,17 +1765,15 @@
               <w:rPr>
                 <w:rFonts w:ascii="맑은 고딕" w:hAnsi="맑은 고딕" w:eastAsia="맑은 고딕"/>
                 <w:b w:val="0"/>
-                <w:sz w:val="19"/>
+                <w:sz w:val="18"/>
               </w:rPr>
-              <w:t>조건 분기를 통해 데이터를 나누며 예측하는 트리 기반 모델</w:t>
+              <w:t>1.705</w:t>
             </w:r>
           </w:p>
         </w:tc>
-      </w:tr>
-      <w:tr>
         <w:tc>
           <w:tcPr>
-            <w:tcW w:type="dxa" w:w="4320"/>
+            <w:tcW w:type="dxa" w:w="1680"/>
             <w:vAlign w:val="center"/>
           </w:tcPr>
           <w:p>
@@ -1347,15 +1782,15 @@
               <w:rPr>
                 <w:rFonts w:ascii="맑은 고딕" w:hAnsi="맑은 고딕" w:eastAsia="맑은 고딕"/>
                 <w:b w:val="0"/>
-                <w:sz w:val="19"/>
+                <w:sz w:val="18"/>
               </w:rPr>
-              <w:t>랜덤 포레스트</w:t>
+              <w:t>2.399</w:t>
             </w:r>
           </w:p>
         </w:tc>
         <w:tc>
           <w:tcPr>
-            <w:tcW w:type="dxa" w:w="4320"/>
+            <w:tcW w:type="dxa" w:w="1680"/>
             <w:vAlign w:val="center"/>
           </w:tcPr>
           <w:p>
@@ -1364,9 +1799,9 @@
               <w:rPr>
                 <w:rFonts w:ascii="맑은 고딕" w:hAnsi="맑은 고딕" w:eastAsia="맑은 고딕"/>
                 <w:b w:val="0"/>
-                <w:sz w:val="19"/>
+                <w:sz w:val="18"/>
               </w:rPr>
-              <w:t>여러 개의 결정나무를 결합하여 예측 안정성을 높인 앙상블 모델</w:t>
+              <w:t>최종 모델</w:t>
             </w:r>
           </w:p>
         </w:tc>
@@ -1374,7 +1809,7 @@
       <w:tr>
         <w:tc>
           <w:tcPr>
-            <w:tcW w:type="dxa" w:w="4320"/>
+            <w:tcW w:type="dxa" w:w="1680"/>
             <w:vAlign w:val="center"/>
           </w:tcPr>
           <w:p>
@@ -1383,15 +1818,15 @@
               <w:rPr>
                 <w:rFonts w:ascii="맑은 고딕" w:hAnsi="맑은 고딕" w:eastAsia="맑은 고딕"/>
                 <w:b w:val="0"/>
-                <w:sz w:val="19"/>
+                <w:sz w:val="18"/>
               </w:rPr>
-              <w:t>KNN 회귀</w:t>
+              <w:t>2</w:t>
             </w:r>
           </w:p>
         </w:tc>
         <w:tc>
           <w:tcPr>
-            <w:tcW w:type="dxa" w:w="4320"/>
+            <w:tcW w:type="dxa" w:w="1680"/>
             <w:vAlign w:val="center"/>
           </w:tcPr>
           <w:p>
@@ -1400,9 +1835,285 @@
               <w:rPr>
                 <w:rFonts w:ascii="맑은 고딕" w:hAnsi="맑은 고딕" w:eastAsia="맑은 고딕"/>
                 <w:b w:val="0"/>
-                <w:sz w:val="19"/>
+                <w:sz w:val="18"/>
               </w:rPr>
-              <w:t>입력값과 가까운 이웃 데이터들의 평균을 활용해 예측하는 모델</w:t>
+              <w:t>KNN 회귀</w:t>
+            </w:r>
+          </w:p>
+        </w:tc>
+        <w:tc>
+          <w:tcPr>
+            <w:tcW w:type="dxa" w:w="1680"/>
+            <w:vAlign w:val="center"/>
+          </w:tcPr>
+          <w:p>
+            <w:r/>
+            <w:r>
+              <w:rPr>
+                <w:rFonts w:ascii="맑은 고딕" w:hAnsi="맑은 고딕" w:eastAsia="맑은 고딕"/>
+                <w:b w:val="0"/>
+                <w:sz w:val="18"/>
+              </w:rPr>
+              <w:t>0.883</w:t>
+            </w:r>
+          </w:p>
+        </w:tc>
+        <w:tc>
+          <w:tcPr>
+            <w:tcW w:type="dxa" w:w="1680"/>
+            <w:vAlign w:val="center"/>
+          </w:tcPr>
+          <w:p>
+            <w:r/>
+            <w:r>
+              <w:rPr>
+                <w:rFonts w:ascii="맑은 고딕" w:hAnsi="맑은 고딕" w:eastAsia="맑은 고딕"/>
+                <w:b w:val="0"/>
+                <w:sz w:val="18"/>
+              </w:rPr>
+              <w:t>1.860</w:t>
+            </w:r>
+          </w:p>
+        </w:tc>
+        <w:tc>
+          <w:tcPr>
+            <w:tcW w:type="dxa" w:w="1680"/>
+            <w:vAlign w:val="center"/>
+          </w:tcPr>
+          <w:p>
+            <w:r/>
+            <w:r>
+              <w:rPr>
+                <w:rFonts w:ascii="맑은 고딕" w:hAnsi="맑은 고딕" w:eastAsia="맑은 고딕"/>
+                <w:b w:val="0"/>
+                <w:sz w:val="18"/>
+              </w:rPr>
+              <w:t>2.440</w:t>
+            </w:r>
+          </w:p>
+        </w:tc>
+        <w:tc>
+          <w:tcPr>
+            <w:tcW w:type="dxa" w:w="1680"/>
+            <w:vAlign w:val="center"/>
+          </w:tcPr>
+          <w:p>
+            <w:r/>
+            <w:r>
+              <w:rPr>
+                <w:rFonts w:ascii="맑은 고딕" w:hAnsi="맑은 고딕" w:eastAsia="맑은 고딕"/>
+                <w:b w:val="0"/>
+                <w:sz w:val="18"/>
+              </w:rPr>
+              <w:t>비교 모델</w:t>
+            </w:r>
+          </w:p>
+        </w:tc>
+      </w:tr>
+      <w:tr>
+        <w:tc>
+          <w:tcPr>
+            <w:tcW w:type="dxa" w:w="1680"/>
+            <w:vAlign w:val="center"/>
+          </w:tcPr>
+          <w:p>
+            <w:r/>
+            <w:r>
+              <w:rPr>
+                <w:rFonts w:ascii="맑은 고딕" w:hAnsi="맑은 고딕" w:eastAsia="맑은 고딕"/>
+                <w:b w:val="0"/>
+                <w:sz w:val="18"/>
+              </w:rPr>
+              <w:t>3</w:t>
+            </w:r>
+          </w:p>
+        </w:tc>
+        <w:tc>
+          <w:tcPr>
+            <w:tcW w:type="dxa" w:w="1680"/>
+            <w:vAlign w:val="center"/>
+          </w:tcPr>
+          <w:p>
+            <w:r/>
+            <w:r>
+              <w:rPr>
+                <w:rFonts w:ascii="맑은 고딕" w:hAnsi="맑은 고딕" w:eastAsia="맑은 고딕"/>
+                <w:b w:val="0"/>
+                <w:sz w:val="18"/>
+              </w:rPr>
+              <w:t>선형회귀</w:t>
+            </w:r>
+          </w:p>
+        </w:tc>
+        <w:tc>
+          <w:tcPr>
+            <w:tcW w:type="dxa" w:w="1680"/>
+            <w:vAlign w:val="center"/>
+          </w:tcPr>
+          <w:p>
+            <w:r/>
+            <w:r>
+              <w:rPr>
+                <w:rFonts w:ascii="맑은 고딕" w:hAnsi="맑은 고딕" w:eastAsia="맑은 고딕"/>
+                <w:b w:val="0"/>
+                <w:sz w:val="18"/>
+              </w:rPr>
+              <w:t>0.794</w:t>
+            </w:r>
+          </w:p>
+        </w:tc>
+        <w:tc>
+          <w:tcPr>
+            <w:tcW w:type="dxa" w:w="1680"/>
+            <w:vAlign w:val="center"/>
+          </w:tcPr>
+          <w:p>
+            <w:r/>
+            <w:r>
+              <w:rPr>
+                <w:rFonts w:ascii="맑은 고딕" w:hAnsi="맑은 고딕" w:eastAsia="맑은 고딕"/>
+                <w:b w:val="0"/>
+                <w:sz w:val="18"/>
+              </w:rPr>
+              <w:t>2.504</w:t>
+            </w:r>
+          </w:p>
+        </w:tc>
+        <w:tc>
+          <w:tcPr>
+            <w:tcW w:type="dxa" w:w="1680"/>
+            <w:vAlign w:val="center"/>
+          </w:tcPr>
+          <w:p>
+            <w:r/>
+            <w:r>
+              <w:rPr>
+                <w:rFonts w:ascii="맑은 고딕" w:hAnsi="맑은 고딕" w:eastAsia="맑은 고딕"/>
+                <w:b w:val="0"/>
+                <w:sz w:val="18"/>
+              </w:rPr>
+              <w:t>3.241</w:t>
+            </w:r>
+          </w:p>
+        </w:tc>
+        <w:tc>
+          <w:tcPr>
+            <w:tcW w:type="dxa" w:w="1680"/>
+            <w:vAlign w:val="center"/>
+          </w:tcPr>
+          <w:p>
+            <w:r/>
+            <w:r>
+              <w:rPr>
+                <w:rFonts w:ascii="맑은 고딕" w:hAnsi="맑은 고딕" w:eastAsia="맑은 고딕"/>
+                <w:b w:val="0"/>
+                <w:sz w:val="18"/>
+              </w:rPr>
+              <w:t>비교 모델</w:t>
+            </w:r>
+          </w:p>
+        </w:tc>
+      </w:tr>
+      <w:tr>
+        <w:tc>
+          <w:tcPr>
+            <w:tcW w:type="dxa" w:w="1680"/>
+            <w:vAlign w:val="center"/>
+          </w:tcPr>
+          <w:p>
+            <w:r/>
+            <w:r>
+              <w:rPr>
+                <w:rFonts w:ascii="맑은 고딕" w:hAnsi="맑은 고딕" w:eastAsia="맑은 고딕"/>
+                <w:b w:val="0"/>
+                <w:sz w:val="18"/>
+              </w:rPr>
+              <w:t>4</w:t>
+            </w:r>
+          </w:p>
+        </w:tc>
+        <w:tc>
+          <w:tcPr>
+            <w:tcW w:type="dxa" w:w="1680"/>
+            <w:vAlign w:val="center"/>
+          </w:tcPr>
+          <w:p>
+            <w:r/>
+            <w:r>
+              <w:rPr>
+                <w:rFonts w:ascii="맑은 고딕" w:hAnsi="맑은 고딕" w:eastAsia="맑은 고딕"/>
+                <w:b w:val="0"/>
+                <w:sz w:val="18"/>
+              </w:rPr>
+              <w:t>의사결정나무</w:t>
+            </w:r>
+          </w:p>
+        </w:tc>
+        <w:tc>
+          <w:tcPr>
+            <w:tcW w:type="dxa" w:w="1680"/>
+            <w:vAlign w:val="center"/>
+          </w:tcPr>
+          <w:p>
+            <w:r/>
+            <w:r>
+              <w:rPr>
+                <w:rFonts w:ascii="맑은 고딕" w:hAnsi="맑은 고딕" w:eastAsia="맑은 고딕"/>
+                <w:b w:val="0"/>
+                <w:sz w:val="18"/>
+              </w:rPr>
+              <w:t>0.772</w:t>
+            </w:r>
+          </w:p>
+        </w:tc>
+        <w:tc>
+          <w:tcPr>
+            <w:tcW w:type="dxa" w:w="1680"/>
+            <w:vAlign w:val="center"/>
+          </w:tcPr>
+          <w:p>
+            <w:r/>
+            <w:r>
+              <w:rPr>
+                <w:rFonts w:ascii="맑은 고딕" w:hAnsi="맑은 고딕" w:eastAsia="맑은 고딕"/>
+                <w:b w:val="0"/>
+                <w:sz w:val="18"/>
+              </w:rPr>
+              <w:t>2.420</w:t>
+            </w:r>
+          </w:p>
+        </w:tc>
+        <w:tc>
+          <w:tcPr>
+            <w:tcW w:type="dxa" w:w="1680"/>
+            <w:vAlign w:val="center"/>
+          </w:tcPr>
+          <w:p>
+            <w:r/>
+            <w:r>
+              <w:rPr>
+                <w:rFonts w:ascii="맑은 고딕" w:hAnsi="맑은 고딕" w:eastAsia="맑은 고딕"/>
+                <w:b w:val="0"/>
+                <w:sz w:val="18"/>
+              </w:rPr>
+              <w:t>3.411</w:t>
+            </w:r>
+          </w:p>
+        </w:tc>
+        <w:tc>
+          <w:tcPr>
+            <w:tcW w:type="dxa" w:w="1680"/>
+            <w:vAlign w:val="center"/>
+          </w:tcPr>
+          <w:p>
+            <w:r/>
+            <w:r>
+              <w:rPr>
+                <w:rFonts w:ascii="맑은 고딕" w:hAnsi="맑은 고딕" w:eastAsia="맑은 고딕"/>
+                <w:b w:val="0"/>
+                <w:sz w:val="18"/>
+              </w:rPr>
+              <w:t>비교 모델</w:t>
             </w:r>
           </w:p>
         </w:tc>
@@ -1411,15 +2122,55 @@
     <w:p/>
     <w:p>
       <w:pPr>
-        <w:pStyle w:val="Heading1"/>
+        <w:jc w:val="center"/>
+      </w:pPr>
+      <w:r>
+        <w:drawing>
+          <wp:inline xmlns:a="http://schemas.openxmlformats.org/drawingml/2006/main" xmlns:pic="http://schemas.openxmlformats.org/drawingml/2006/picture">
+            <wp:extent cx="5394960" cy="3147060"/>
+            <wp:docPr id="3" name="Picture 3"/>
+            <wp:cNvGraphicFramePr>
+              <a:graphicFrameLocks noChangeAspect="1"/>
+            </wp:cNvGraphicFramePr>
+            <a:graphic>
+              <a:graphicData uri="http://schemas.openxmlformats.org/drawingml/2006/picture">
+                <pic:pic>
+                  <pic:nvPicPr>
+                    <pic:cNvPr id="0" name="final_rmse_comparison.png"/>
+                    <pic:cNvPicPr/>
+                  </pic:nvPicPr>
+                  <pic:blipFill>
+                    <a:blip r:embed="rId11"/>
+                    <a:stretch>
+                      <a:fillRect/>
+                    </a:stretch>
+                  </pic:blipFill>
+                  <pic:spPr>
+                    <a:xfrm>
+                      <a:off x="0" y="0"/>
+                      <a:ext cx="5394960" cy="3147060"/>
+                    </a:xfrm>
+                    <a:prstGeom prst="rect"/>
+                  </pic:spPr>
+                </pic:pic>
+              </a:graphicData>
+            </a:graphic>
+          </wp:inline>
+        </w:drawing>
+      </w:r>
+    </w:p>
+    <w:p>
+      <w:pPr>
+        <w:jc w:val="center"/>
       </w:pPr>
       <w:r>
         <w:rPr>
           <w:rFonts w:ascii="맑은 고딕" w:hAnsi="맑은 고딕" w:eastAsia="맑은 고딕"/>
-          <w:b/>
-          <w:sz w:val="36"/>
+          <w:b w:val="0"/>
+          <w:color w:val="4D5F78"/>
+          <w:sz w:val="18"/>
         </w:rPr>
-        <w:t>5. 모델 성능 비교</w:t>
+        <w:t>그림 3. 모델별 RMSE 비교</w:t>
       </w:r>
     </w:p>
     <w:p>
@@ -1432,489 +2183,60 @@
           <w:b w:val="0"/>
           <w:sz w:val="21"/>
         </w:rPr>
-        <w:t>성능 평가는 R², MAE, RMSE를 기준으로 수행하였다. RMSE는 예측 오차를 나타내므로 값이 낮을수록 좋고, R²는 모델 설명력을 나타내므로 값이 높을수록 좋다.</w:t>
+        <w:t>RMSE 비교 결과 랜덤 포레스트 모델이 가장 낮은 오차를 보였다. 따라서 Streamlit 앱에서는 이 모델을 최종 예측 모델로 사용하였다.</w:t>
       </w:r>
     </w:p>
-    <w:tbl>
-      <w:tblPr>
-        <w:tblStyle w:val="TableGrid"/>
-        <w:tblW w:type="auto" w:w="0"/>
-        <w:jc w:val="center"/>
-        <w:tblLook w:firstColumn="1" w:firstRow="1" w:lastColumn="0" w:lastRow="0" w:noHBand="0" w:noVBand="1" w:val="04A0"/>
-      </w:tblPr>
-      <w:tblGrid>
-        <w:gridCol w:w="1728"/>
-        <w:gridCol w:w="1728"/>
-        <w:gridCol w:w="1728"/>
-        <w:gridCol w:w="1728"/>
-        <w:gridCol w:w="1728"/>
-      </w:tblGrid>
-      <w:tr>
-        <w:tc>
-          <w:tcPr>
-            <w:tcW w:type="dxa" w:w="1728"/>
-            <w:vAlign w:val="center"/>
-            <w:shd w:fill="D9EAF7"/>
-          </w:tcPr>
-          <w:p>
-            <w:r/>
-            <w:r>
-              <w:rPr>
-                <w:rFonts w:ascii="맑은 고딕" w:hAnsi="맑은 고딕" w:eastAsia="맑은 고딕"/>
-                <w:b/>
-                <w:sz w:val="19"/>
-              </w:rPr>
-              <w:t>모델</w:t>
-            </w:r>
-          </w:p>
-        </w:tc>
-        <w:tc>
-          <w:tcPr>
-            <w:tcW w:type="dxa" w:w="1728"/>
-            <w:vAlign w:val="center"/>
-            <w:shd w:fill="D9EAF7"/>
-          </w:tcPr>
-          <w:p>
-            <w:r/>
-            <w:r>
-              <w:rPr>
-                <w:rFonts w:ascii="맑은 고딕" w:hAnsi="맑은 고딕" w:eastAsia="맑은 고딕"/>
-                <w:b/>
-                <w:sz w:val="19"/>
-              </w:rPr>
-              <w:t>R²</w:t>
-            </w:r>
-          </w:p>
-        </w:tc>
-        <w:tc>
-          <w:tcPr>
-            <w:tcW w:type="dxa" w:w="1728"/>
-            <w:vAlign w:val="center"/>
-            <w:shd w:fill="D9EAF7"/>
-          </w:tcPr>
-          <w:p>
-            <w:r/>
-            <w:r>
-              <w:rPr>
-                <w:rFonts w:ascii="맑은 고딕" w:hAnsi="맑은 고딕" w:eastAsia="맑은 고딕"/>
-                <w:b/>
-                <w:sz w:val="19"/>
-              </w:rPr>
-              <w:t>MAE</w:t>
-            </w:r>
-          </w:p>
-        </w:tc>
-        <w:tc>
-          <w:tcPr>
-            <w:tcW w:type="dxa" w:w="1728"/>
-            <w:vAlign w:val="center"/>
-            <w:shd w:fill="D9EAF7"/>
-          </w:tcPr>
-          <w:p>
-            <w:r/>
-            <w:r>
-              <w:rPr>
-                <w:rFonts w:ascii="맑은 고딕" w:hAnsi="맑은 고딕" w:eastAsia="맑은 고딕"/>
-                <w:b/>
-                <w:sz w:val="19"/>
-              </w:rPr>
-              <w:t>RMSE</w:t>
-            </w:r>
-          </w:p>
-        </w:tc>
-        <w:tc>
-          <w:tcPr>
-            <w:tcW w:type="dxa" w:w="1728"/>
-            <w:vAlign w:val="center"/>
-            <w:shd w:fill="D9EAF7"/>
-          </w:tcPr>
-          <w:p>
-            <w:r/>
-            <w:r>
-              <w:rPr>
-                <w:rFonts w:ascii="맑은 고딕" w:hAnsi="맑은 고딕" w:eastAsia="맑은 고딕"/>
-                <w:b/>
-                <w:sz w:val="19"/>
-              </w:rPr>
-              <w:t>선택 여부</w:t>
-            </w:r>
-          </w:p>
-        </w:tc>
-      </w:tr>
-      <w:tr>
-        <w:tc>
-          <w:tcPr>
-            <w:tcW w:type="dxa" w:w="1728"/>
-            <w:vAlign w:val="center"/>
-          </w:tcPr>
-          <w:p>
-            <w:r/>
-            <w:r>
-              <w:rPr>
-                <w:rFonts w:ascii="맑은 고딕" w:hAnsi="맑은 고딕" w:eastAsia="맑은 고딕"/>
-                <w:b w:val="0"/>
-                <w:sz w:val="19"/>
-              </w:rPr>
-              <w:t>랜덤 포레스트</w:t>
-            </w:r>
-          </w:p>
-        </w:tc>
-        <w:tc>
-          <w:tcPr>
-            <w:tcW w:type="dxa" w:w="1728"/>
-            <w:vAlign w:val="center"/>
-          </w:tcPr>
-          <w:p>
-            <w:r/>
-            <w:r>
-              <w:rPr>
-                <w:rFonts w:ascii="맑은 고딕" w:hAnsi="맑은 고딕" w:eastAsia="맑은 고딕"/>
-                <w:b w:val="0"/>
-                <w:sz w:val="19"/>
-              </w:rPr>
-              <w:t>0.887</w:t>
-            </w:r>
-          </w:p>
-        </w:tc>
-        <w:tc>
-          <w:tcPr>
-            <w:tcW w:type="dxa" w:w="1728"/>
-            <w:vAlign w:val="center"/>
-          </w:tcPr>
-          <w:p>
-            <w:r/>
-            <w:r>
-              <w:rPr>
-                <w:rFonts w:ascii="맑은 고딕" w:hAnsi="맑은 고딕" w:eastAsia="맑은 고딕"/>
-                <w:b w:val="0"/>
-                <w:sz w:val="19"/>
-              </w:rPr>
-              <w:t>1.705</w:t>
-            </w:r>
-          </w:p>
-        </w:tc>
-        <w:tc>
-          <w:tcPr>
-            <w:tcW w:type="dxa" w:w="1728"/>
-            <w:vAlign w:val="center"/>
-          </w:tcPr>
-          <w:p>
-            <w:r/>
-            <w:r>
-              <w:rPr>
-                <w:rFonts w:ascii="맑은 고딕" w:hAnsi="맑은 고딕" w:eastAsia="맑은 고딕"/>
-                <w:b w:val="0"/>
-                <w:sz w:val="19"/>
-              </w:rPr>
-              <w:t>2.399</w:t>
-            </w:r>
-          </w:p>
-        </w:tc>
-        <w:tc>
-          <w:tcPr>
-            <w:tcW w:type="dxa" w:w="1728"/>
-            <w:vAlign w:val="center"/>
-          </w:tcPr>
-          <w:p>
-            <w:r/>
-            <w:r>
-              <w:rPr>
-                <w:rFonts w:ascii="맑은 고딕" w:hAnsi="맑은 고딕" w:eastAsia="맑은 고딕"/>
-                <w:b w:val="0"/>
-                <w:sz w:val="19"/>
-              </w:rPr>
-              <w:t>최종 모델</w:t>
-            </w:r>
-          </w:p>
-        </w:tc>
-      </w:tr>
-      <w:tr>
-        <w:tc>
-          <w:tcPr>
-            <w:tcW w:type="dxa" w:w="1728"/>
-            <w:vAlign w:val="center"/>
-          </w:tcPr>
-          <w:p>
-            <w:r/>
-            <w:r>
-              <w:rPr>
-                <w:rFonts w:ascii="맑은 고딕" w:hAnsi="맑은 고딕" w:eastAsia="맑은 고딕"/>
-                <w:b w:val="0"/>
-                <w:sz w:val="19"/>
-              </w:rPr>
-              <w:t>KNN 회귀</w:t>
-            </w:r>
-          </w:p>
-        </w:tc>
-        <w:tc>
-          <w:tcPr>
-            <w:tcW w:type="dxa" w:w="1728"/>
-            <w:vAlign w:val="center"/>
-          </w:tcPr>
-          <w:p>
-            <w:r/>
-            <w:r>
-              <w:rPr>
-                <w:rFonts w:ascii="맑은 고딕" w:hAnsi="맑은 고딕" w:eastAsia="맑은 고딕"/>
-                <w:b w:val="0"/>
-                <w:sz w:val="19"/>
-              </w:rPr>
-              <w:t>0.883</w:t>
-            </w:r>
-          </w:p>
-        </w:tc>
-        <w:tc>
-          <w:tcPr>
-            <w:tcW w:type="dxa" w:w="1728"/>
-            <w:vAlign w:val="center"/>
-          </w:tcPr>
-          <w:p>
-            <w:r/>
-            <w:r>
-              <w:rPr>
-                <w:rFonts w:ascii="맑은 고딕" w:hAnsi="맑은 고딕" w:eastAsia="맑은 고딕"/>
-                <w:b w:val="0"/>
-                <w:sz w:val="19"/>
-              </w:rPr>
-              <w:t>1.86</w:t>
-            </w:r>
-          </w:p>
-        </w:tc>
-        <w:tc>
-          <w:tcPr>
-            <w:tcW w:type="dxa" w:w="1728"/>
-            <w:vAlign w:val="center"/>
-          </w:tcPr>
-          <w:p>
-            <w:r/>
-            <w:r>
-              <w:rPr>
-                <w:rFonts w:ascii="맑은 고딕" w:hAnsi="맑은 고딕" w:eastAsia="맑은 고딕"/>
-                <w:b w:val="0"/>
-                <w:sz w:val="19"/>
-              </w:rPr>
-              <w:t>2.44</w:t>
-            </w:r>
-          </w:p>
-        </w:tc>
-        <w:tc>
-          <w:tcPr>
-            <w:tcW w:type="dxa" w:w="1728"/>
-            <w:vAlign w:val="center"/>
-          </w:tcPr>
-          <w:p>
-            <w:r/>
-            <w:r>
-              <w:rPr>
-                <w:rFonts w:ascii="맑은 고딕" w:hAnsi="맑은 고딕" w:eastAsia="맑은 고딕"/>
-                <w:b w:val="0"/>
-                <w:sz w:val="19"/>
-              </w:rPr>
-              <w:t>비교 모델</w:t>
-            </w:r>
-          </w:p>
-        </w:tc>
-      </w:tr>
-      <w:tr>
-        <w:tc>
-          <w:tcPr>
-            <w:tcW w:type="dxa" w:w="1728"/>
-            <w:vAlign w:val="center"/>
-          </w:tcPr>
-          <w:p>
-            <w:r/>
-            <w:r>
-              <w:rPr>
-                <w:rFonts w:ascii="맑은 고딕" w:hAnsi="맑은 고딕" w:eastAsia="맑은 고딕"/>
-                <w:b w:val="0"/>
-                <w:sz w:val="19"/>
-              </w:rPr>
-              <w:t>선형회귀</w:t>
-            </w:r>
-          </w:p>
-        </w:tc>
-        <w:tc>
-          <w:tcPr>
-            <w:tcW w:type="dxa" w:w="1728"/>
-            <w:vAlign w:val="center"/>
-          </w:tcPr>
-          <w:p>
-            <w:r/>
-            <w:r>
-              <w:rPr>
-                <w:rFonts w:ascii="맑은 고딕" w:hAnsi="맑은 고딕" w:eastAsia="맑은 고딕"/>
-                <w:b w:val="0"/>
-                <w:sz w:val="19"/>
-              </w:rPr>
-              <w:t>0.794</w:t>
-            </w:r>
-          </w:p>
-        </w:tc>
-        <w:tc>
-          <w:tcPr>
-            <w:tcW w:type="dxa" w:w="1728"/>
-            <w:vAlign w:val="center"/>
-          </w:tcPr>
-          <w:p>
-            <w:r/>
-            <w:r>
-              <w:rPr>
-                <w:rFonts w:ascii="맑은 고딕" w:hAnsi="맑은 고딕" w:eastAsia="맑은 고딕"/>
-                <w:b w:val="0"/>
-                <w:sz w:val="19"/>
-              </w:rPr>
-              <w:t>2.504</w:t>
-            </w:r>
-          </w:p>
-        </w:tc>
-        <w:tc>
-          <w:tcPr>
-            <w:tcW w:type="dxa" w:w="1728"/>
-            <w:vAlign w:val="center"/>
-          </w:tcPr>
-          <w:p>
-            <w:r/>
-            <w:r>
-              <w:rPr>
-                <w:rFonts w:ascii="맑은 고딕" w:hAnsi="맑은 고딕" w:eastAsia="맑은 고딕"/>
-                <w:b w:val="0"/>
-                <w:sz w:val="19"/>
-              </w:rPr>
-              <w:t>3.241</w:t>
-            </w:r>
-          </w:p>
-        </w:tc>
-        <w:tc>
-          <w:tcPr>
-            <w:tcW w:type="dxa" w:w="1728"/>
-            <w:vAlign w:val="center"/>
-          </w:tcPr>
-          <w:p>
-            <w:r/>
-            <w:r>
-              <w:rPr>
-                <w:rFonts w:ascii="맑은 고딕" w:hAnsi="맑은 고딕" w:eastAsia="맑은 고딕"/>
-                <w:b w:val="0"/>
-                <w:sz w:val="19"/>
-              </w:rPr>
-              <w:t>비교 모델</w:t>
-            </w:r>
-          </w:p>
-        </w:tc>
-      </w:tr>
-      <w:tr>
-        <w:tc>
-          <w:tcPr>
-            <w:tcW w:type="dxa" w:w="1728"/>
-            <w:vAlign w:val="center"/>
-          </w:tcPr>
-          <w:p>
-            <w:r/>
-            <w:r>
-              <w:rPr>
-                <w:rFonts w:ascii="맑은 고딕" w:hAnsi="맑은 고딕" w:eastAsia="맑은 고딕"/>
-                <w:b w:val="0"/>
-                <w:sz w:val="19"/>
-              </w:rPr>
-              <w:t>의사결정나무</w:t>
-            </w:r>
-          </w:p>
-        </w:tc>
-        <w:tc>
-          <w:tcPr>
-            <w:tcW w:type="dxa" w:w="1728"/>
-            <w:vAlign w:val="center"/>
-          </w:tcPr>
-          <w:p>
-            <w:r/>
-            <w:r>
-              <w:rPr>
-                <w:rFonts w:ascii="맑은 고딕" w:hAnsi="맑은 고딕" w:eastAsia="맑은 고딕"/>
-                <w:b w:val="0"/>
-                <w:sz w:val="19"/>
-              </w:rPr>
-              <w:t>0.772</w:t>
-            </w:r>
-          </w:p>
-        </w:tc>
-        <w:tc>
-          <w:tcPr>
-            <w:tcW w:type="dxa" w:w="1728"/>
-            <w:vAlign w:val="center"/>
-          </w:tcPr>
-          <w:p>
-            <w:r/>
-            <w:r>
-              <w:rPr>
-                <w:rFonts w:ascii="맑은 고딕" w:hAnsi="맑은 고딕" w:eastAsia="맑은 고딕"/>
-                <w:b w:val="0"/>
-                <w:sz w:val="19"/>
-              </w:rPr>
-              <w:t>2.42</w:t>
-            </w:r>
-          </w:p>
-        </w:tc>
-        <w:tc>
-          <w:tcPr>
-            <w:tcW w:type="dxa" w:w="1728"/>
-            <w:vAlign w:val="center"/>
-          </w:tcPr>
-          <w:p>
-            <w:r/>
-            <w:r>
-              <w:rPr>
-                <w:rFonts w:ascii="맑은 고딕" w:hAnsi="맑은 고딕" w:eastAsia="맑은 고딕"/>
-                <w:b w:val="0"/>
-                <w:sz w:val="19"/>
-              </w:rPr>
-              <w:t>3.411</w:t>
-            </w:r>
-          </w:p>
-        </w:tc>
-        <w:tc>
-          <w:tcPr>
-            <w:tcW w:type="dxa" w:w="1728"/>
-            <w:vAlign w:val="center"/>
-          </w:tcPr>
-          <w:p>
-            <w:r/>
-            <w:r>
-              <w:rPr>
-                <w:rFonts w:ascii="맑은 고딕" w:hAnsi="맑은 고딕" w:eastAsia="맑은 고딕"/>
-                <w:b w:val="0"/>
-                <w:sz w:val="19"/>
-              </w:rPr>
-              <w:t>비교 모델</w:t>
-            </w:r>
-          </w:p>
-        </w:tc>
-      </w:tr>
-    </w:tbl>
-    <w:p/>
     <w:p>
       <w:pPr>
-        <w:spacing w:line="324" w:lineRule="auto"/>
+        <w:jc w:val="center"/>
+      </w:pPr>
+      <w:r>
+        <w:drawing>
+          <wp:inline xmlns:a="http://schemas.openxmlformats.org/drawingml/2006/main" xmlns:pic="http://schemas.openxmlformats.org/drawingml/2006/picture">
+            <wp:extent cx="5852160" cy="4455421"/>
+            <wp:docPr id="4" name="Picture 4"/>
+            <wp:cNvGraphicFramePr>
+              <a:graphicFrameLocks noChangeAspect="1"/>
+            </wp:cNvGraphicFramePr>
+            <a:graphic>
+              <a:graphicData uri="http://schemas.openxmlformats.org/drawingml/2006/picture">
+                <pic:pic>
+                  <pic:nvPicPr>
+                    <pic:cNvPr id="0" name="final_prediction_comparison.png"/>
+                    <pic:cNvPicPr/>
+                  </pic:nvPicPr>
+                  <pic:blipFill>
+                    <a:blip r:embed="rId12"/>
+                    <a:stretch>
+                      <a:fillRect/>
+                    </a:stretch>
+                  </pic:blipFill>
+                  <pic:spPr>
+                    <a:xfrm>
+                      <a:off x="0" y="0"/>
+                      <a:ext cx="5852160" cy="4455421"/>
+                    </a:xfrm>
+                    <a:prstGeom prst="rect"/>
+                  </pic:spPr>
+                </pic:pic>
+              </a:graphicData>
+            </a:graphic>
+          </wp:inline>
+        </w:drawing>
+      </w:r>
+    </w:p>
+    <w:p>
+      <w:pPr>
+        <w:jc w:val="center"/>
       </w:pPr>
       <w:r>
         <w:rPr>
           <w:rFonts w:ascii="맑은 고딕" w:hAnsi="맑은 고딕" w:eastAsia="맑은 고딕"/>
           <w:b w:val="0"/>
-          <w:sz w:val="21"/>
+          <w:color w:val="4D5F78"/>
+          <w:sz w:val="18"/>
         </w:rPr>
-        <w:t>비교 결과 RMSE가 가장 낮은 모델은 랜덤 포레스트이며, 테스트 데이터 기준 RMSE 2.399, R² 0.887, MAE 1.705의 성능을 보였다. 따라서 해당 모델을 Streamlit 앱의 최종 예측 모델로 사용하였다.</w:t>
-      </w:r>
-    </w:p>
-    <w:p>
-      <w:pPr>
-        <w:pStyle w:val="Heading1"/>
-      </w:pPr>
-      <w:r>
-        <w:rPr>
-          <w:rFonts w:ascii="맑은 고딕" w:hAnsi="맑은 고딕" w:eastAsia="맑은 고딕"/>
-          <w:b/>
-          <w:sz w:val="36"/>
-        </w:rPr>
-        <w:t>6. 특성 영향 분석</w:t>
+        <w:t>그림 4. 학습 모델별 실제값과 예측값 비교</w:t>
       </w:r>
     </w:p>
     <w:p>
@@ -1927,7 +2249,34 @@
           <w:b w:val="0"/>
           <w:sz w:val="21"/>
         </w:rPr>
-        <w:t>최종 선택 모델 기준으로 입력 변수가 예측에 얼마나 영향을 주는지 확인하였다. 랜덤 포레스트는 feature_importances_ 값을 제공하므로 이를 특성 영향도로 사용하였다.</w:t>
+        <w:t>실제값과 예측값 비교 그래프에서 점들이 붉은 대각선에 가까울수록 예측이 정확하다고 볼 수 있다. 모델별 그래프를 함께 보면 단순 성능표뿐 아니라 예측값이 실제값을 얼마나 잘 따라가는지도 확인할 수 있다.</w:t>
+      </w:r>
+    </w:p>
+    <w:p>
+      <w:pPr>
+        <w:pStyle w:val="Heading1"/>
+      </w:pPr>
+      <w:r>
+        <w:rPr>
+          <w:rFonts w:ascii="맑은 고딕" w:hAnsi="맑은 고딕" w:eastAsia="맑은 고딕"/>
+          <w:b/>
+          <w:color w:val="162033"/>
+          <w:sz w:val="32"/>
+        </w:rPr>
+        <w:t>6. 최종 모델 특성 영향 분석</w:t>
+      </w:r>
+    </w:p>
+    <w:p>
+      <w:pPr>
+        <w:spacing w:line="324" w:lineRule="auto"/>
+      </w:pPr>
+      <w:r>
+        <w:rPr>
+          <w:rFonts w:ascii="맑은 고딕" w:hAnsi="맑은 고딕" w:eastAsia="맑은 고딕"/>
+          <w:b w:val="0"/>
+          <w:sz w:val="21"/>
+        </w:rPr>
+        <w:t>최종 선택 모델 기준으로 각 입력 변수가 예측에 어느 정도 반영되었는지 확인하였다. 중요도가 높은 변수일수록 연비 예측 결과에 더 큰 영향을 준다.</w:t>
       </w:r>
     </w:p>
     <w:tbl>
@@ -1938,13 +2287,13 @@
         <w:tblLook w:firstColumn="1" w:firstRow="1" w:lastColumn="0" w:lastRow="0" w:noHBand="0" w:noVBand="1" w:val="04A0"/>
       </w:tblPr>
       <w:tblGrid>
-        <w:gridCol w:w="4320"/>
-        <w:gridCol w:w="4320"/>
+        <w:gridCol w:w="5040"/>
+        <w:gridCol w:w="5040"/>
       </w:tblGrid>
       <w:tr>
         <w:tc>
           <w:tcPr>
-            <w:tcW w:type="dxa" w:w="4320"/>
+            <w:tcW w:type="dxa" w:w="5040"/>
             <w:vAlign w:val="center"/>
             <w:shd w:fill="D9EAF7"/>
           </w:tcPr>
@@ -1954,7 +2303,7 @@
               <w:rPr>
                 <w:rFonts w:ascii="맑은 고딕" w:hAnsi="맑은 고딕" w:eastAsia="맑은 고딕"/>
                 <w:b/>
-                <w:sz w:val="19"/>
+                <w:sz w:val="18"/>
               </w:rPr>
               <w:t>특성</w:t>
             </w:r>
@@ -1962,7 +2311,7 @@
         </w:tc>
         <w:tc>
           <w:tcPr>
-            <w:tcW w:type="dxa" w:w="4320"/>
+            <w:tcW w:type="dxa" w:w="5040"/>
             <w:vAlign w:val="center"/>
             <w:shd w:fill="D9EAF7"/>
           </w:tcPr>
@@ -1972,7 +2321,7 @@
               <w:rPr>
                 <w:rFonts w:ascii="맑은 고딕" w:hAnsi="맑은 고딕" w:eastAsia="맑은 고딕"/>
                 <w:b/>
-                <w:sz w:val="19"/>
+                <w:sz w:val="18"/>
               </w:rPr>
               <w:t>중요도</w:t>
             </w:r>
@@ -1982,7 +2331,7 @@
       <w:tr>
         <w:tc>
           <w:tcPr>
-            <w:tcW w:type="dxa" w:w="4320"/>
+            <w:tcW w:type="dxa" w:w="5040"/>
             <w:vAlign w:val="center"/>
           </w:tcPr>
           <w:p>
@@ -1991,7 +2340,7 @@
               <w:rPr>
                 <w:rFonts w:ascii="맑은 고딕" w:hAnsi="맑은 고딕" w:eastAsia="맑은 고딕"/>
                 <w:b w:val="0"/>
-                <w:sz w:val="19"/>
+                <w:sz w:val="18"/>
               </w:rPr>
               <w:t>배기량</w:t>
             </w:r>
@@ -1999,7 +2348,7 @@
         </w:tc>
         <w:tc>
           <w:tcPr>
-            <w:tcW w:type="dxa" w:w="4320"/>
+            <w:tcW w:type="dxa" w:w="5040"/>
             <w:vAlign w:val="center"/>
           </w:tcPr>
           <w:p>
@@ -2008,7 +2357,7 @@
               <w:rPr>
                 <w:rFonts w:ascii="맑은 고딕" w:hAnsi="맑은 고딕" w:eastAsia="맑은 고딕"/>
                 <w:b w:val="0"/>
-                <w:sz w:val="19"/>
+                <w:sz w:val="18"/>
               </w:rPr>
               <w:t>0.4239</w:t>
             </w:r>
@@ -2018,7 +2367,7 @@
       <w:tr>
         <w:tc>
           <w:tcPr>
-            <w:tcW w:type="dxa" w:w="4320"/>
+            <w:tcW w:type="dxa" w:w="5040"/>
             <w:vAlign w:val="center"/>
           </w:tcPr>
           <w:p>
@@ -2027,7 +2376,7 @@
               <w:rPr>
                 <w:rFonts w:ascii="맑은 고딕" w:hAnsi="맑은 고딕" w:eastAsia="맑은 고딕"/>
                 <w:b w:val="0"/>
-                <w:sz w:val="19"/>
+                <w:sz w:val="18"/>
               </w:rPr>
               <w:t>마력</w:t>
             </w:r>
@@ -2035,7 +2384,7 @@
         </w:tc>
         <w:tc>
           <w:tcPr>
-            <w:tcW w:type="dxa" w:w="4320"/>
+            <w:tcW w:type="dxa" w:w="5040"/>
             <w:vAlign w:val="center"/>
           </w:tcPr>
           <w:p>
@@ -2044,7 +2393,7 @@
               <w:rPr>
                 <w:rFonts w:ascii="맑은 고딕" w:hAnsi="맑은 고딕" w:eastAsia="맑은 고딕"/>
                 <w:b w:val="0"/>
-                <w:sz w:val="19"/>
+                <w:sz w:val="18"/>
               </w:rPr>
               <w:t>0.1715</w:t>
             </w:r>
@@ -2054,7 +2403,7 @@
       <w:tr>
         <w:tc>
           <w:tcPr>
-            <w:tcW w:type="dxa" w:w="4320"/>
+            <w:tcW w:type="dxa" w:w="5040"/>
             <w:vAlign w:val="center"/>
           </w:tcPr>
           <w:p>
@@ -2063,7 +2412,7 @@
               <w:rPr>
                 <w:rFonts w:ascii="맑은 고딕" w:hAnsi="맑은 고딕" w:eastAsia="맑은 고딕"/>
                 <w:b w:val="0"/>
-                <w:sz w:val="19"/>
+                <w:sz w:val="18"/>
               </w:rPr>
               <w:t>무게</w:t>
             </w:r>
@@ -2071,7 +2420,7 @@
         </w:tc>
         <w:tc>
           <w:tcPr>
-            <w:tcW w:type="dxa" w:w="4320"/>
+            <w:tcW w:type="dxa" w:w="5040"/>
             <w:vAlign w:val="center"/>
           </w:tcPr>
           <w:p>
@@ -2080,7 +2429,7 @@
               <w:rPr>
                 <w:rFonts w:ascii="맑은 고딕" w:hAnsi="맑은 고딕" w:eastAsia="맑은 고딕"/>
                 <w:b w:val="0"/>
-                <w:sz w:val="19"/>
+                <w:sz w:val="18"/>
               </w:rPr>
               <w:t>0.1429</w:t>
             </w:r>
@@ -2090,7 +2439,7 @@
       <w:tr>
         <w:tc>
           <w:tcPr>
-            <w:tcW w:type="dxa" w:w="4320"/>
+            <w:tcW w:type="dxa" w:w="5040"/>
             <w:vAlign w:val="center"/>
           </w:tcPr>
           <w:p>
@@ -2099,7 +2448,7 @@
               <w:rPr>
                 <w:rFonts w:ascii="맑은 고딕" w:hAnsi="맑은 고딕" w:eastAsia="맑은 고딕"/>
                 <w:b w:val="0"/>
-                <w:sz w:val="19"/>
+                <w:sz w:val="18"/>
               </w:rPr>
               <w:t>실린더 수</w:t>
             </w:r>
@@ -2107,7 +2456,7 @@
         </w:tc>
         <w:tc>
           <w:tcPr>
-            <w:tcW w:type="dxa" w:w="4320"/>
+            <w:tcW w:type="dxa" w:w="5040"/>
             <w:vAlign w:val="center"/>
           </w:tcPr>
           <w:p>
@@ -2116,7 +2465,7 @@
               <w:rPr>
                 <w:rFonts w:ascii="맑은 고딕" w:hAnsi="맑은 고딕" w:eastAsia="맑은 고딕"/>
                 <w:b w:val="0"/>
-                <w:sz w:val="19"/>
+                <w:sz w:val="18"/>
               </w:rPr>
               <w:t>0.1355</w:t>
             </w:r>
@@ -2126,7 +2475,7 @@
       <w:tr>
         <w:tc>
           <w:tcPr>
-            <w:tcW w:type="dxa" w:w="4320"/>
+            <w:tcW w:type="dxa" w:w="5040"/>
             <w:vAlign w:val="center"/>
           </w:tcPr>
           <w:p>
@@ -2135,7 +2484,7 @@
               <w:rPr>
                 <w:rFonts w:ascii="맑은 고딕" w:hAnsi="맑은 고딕" w:eastAsia="맑은 고딕"/>
                 <w:b w:val="0"/>
-                <w:sz w:val="19"/>
+                <w:sz w:val="18"/>
               </w:rPr>
               <w:t>연식</w:t>
             </w:r>
@@ -2143,7 +2492,7 @@
         </w:tc>
         <w:tc>
           <w:tcPr>
-            <w:tcW w:type="dxa" w:w="4320"/>
+            <w:tcW w:type="dxa" w:w="5040"/>
             <w:vAlign w:val="center"/>
           </w:tcPr>
           <w:p>
@@ -2152,7 +2501,7 @@
               <w:rPr>
                 <w:rFonts w:ascii="맑은 고딕" w:hAnsi="맑은 고딕" w:eastAsia="맑은 고딕"/>
                 <w:b w:val="0"/>
-                <w:sz w:val="19"/>
+                <w:sz w:val="18"/>
               </w:rPr>
               <w:t>0.1029</w:t>
             </w:r>
@@ -2162,7 +2511,7 @@
       <w:tr>
         <w:tc>
           <w:tcPr>
-            <w:tcW w:type="dxa" w:w="4320"/>
+            <w:tcW w:type="dxa" w:w="5040"/>
             <w:vAlign w:val="center"/>
           </w:tcPr>
           <w:p>
@@ -2171,7 +2520,7 @@
               <w:rPr>
                 <w:rFonts w:ascii="맑은 고딕" w:hAnsi="맑은 고딕" w:eastAsia="맑은 고딕"/>
                 <w:b w:val="0"/>
-                <w:sz w:val="19"/>
+                <w:sz w:val="18"/>
               </w:rPr>
               <w:t>가속력</w:t>
             </w:r>
@@ -2179,7 +2528,7 @@
         </w:tc>
         <w:tc>
           <w:tcPr>
-            <w:tcW w:type="dxa" w:w="4320"/>
+            <w:tcW w:type="dxa" w:w="5040"/>
             <w:vAlign w:val="center"/>
           </w:tcPr>
           <w:p>
@@ -2188,7 +2537,7 @@
               <w:rPr>
                 <w:rFonts w:ascii="맑은 고딕" w:hAnsi="맑은 고딕" w:eastAsia="맑은 고딕"/>
                 <w:b w:val="0"/>
-                <w:sz w:val="19"/>
+                <w:sz w:val="18"/>
               </w:rPr>
               <w:t>0.0232</w:t>
             </w:r>
@@ -2199,13 +2548,85 @@
     <w:p/>
     <w:p>
       <w:pPr>
+        <w:jc w:val="center"/>
+      </w:pPr>
+      <w:r>
+        <w:drawing>
+          <wp:inline xmlns:a="http://schemas.openxmlformats.org/drawingml/2006/main" xmlns:pic="http://schemas.openxmlformats.org/drawingml/2006/picture">
+            <wp:extent cx="5394960" cy="3147060"/>
+            <wp:docPr id="5" name="Picture 5"/>
+            <wp:cNvGraphicFramePr>
+              <a:graphicFrameLocks noChangeAspect="1"/>
+            </wp:cNvGraphicFramePr>
+            <a:graphic>
+              <a:graphicData uri="http://schemas.openxmlformats.org/drawingml/2006/picture">
+                <pic:pic>
+                  <pic:nvPicPr>
+                    <pic:cNvPr id="0" name="final_feature_importance.png"/>
+                    <pic:cNvPicPr/>
+                  </pic:nvPicPr>
+                  <pic:blipFill>
+                    <a:blip r:embed="rId13"/>
+                    <a:stretch>
+                      <a:fillRect/>
+                    </a:stretch>
+                  </pic:blipFill>
+                  <pic:spPr>
+                    <a:xfrm>
+                      <a:off x="0" y="0"/>
+                      <a:ext cx="5394960" cy="3147060"/>
+                    </a:xfrm>
+                    <a:prstGeom prst="rect"/>
+                  </pic:spPr>
+                </pic:pic>
+              </a:graphicData>
+            </a:graphic>
+          </wp:inline>
+        </w:drawing>
+      </w:r>
+    </w:p>
+    <w:p>
+      <w:pPr>
+        <w:jc w:val="center"/>
+      </w:pPr>
+      <w:r>
+        <w:rPr>
+          <w:rFonts w:ascii="맑은 고딕" w:hAnsi="맑은 고딕" w:eastAsia="맑은 고딕"/>
+          <w:b w:val="0"/>
+          <w:color w:val="4D5F78"/>
+          <w:sz w:val="18"/>
+        </w:rPr>
+        <w:t>그림 5. 최종 모델의 특성 영향도</w:t>
+      </w:r>
+    </w:p>
+    <w:p>
+      <w:pPr>
+        <w:spacing w:line="324" w:lineRule="auto"/>
+      </w:pPr>
+      <w:r>
+        <w:rPr>
+          <w:rFonts w:ascii="맑은 고딕" w:hAnsi="맑은 고딕" w:eastAsia="맑은 고딕"/>
+          <w:b w:val="0"/>
+          <w:sz w:val="21"/>
+        </w:rPr>
+        <w:t>특성 영향도 그래프를 통해 모델이 어떤 차량 제원을 더 중요하게 판단하는지 확인할 수 있다. 보고서에서는 숫자 표와 그래프를 함께 제시하여 결과를 더 쉽게 비교할 수 있도록 하였다.</w:t>
+      </w:r>
+    </w:p>
+    <w:p>
+      <w:r>
+        <w:br w:type="page"/>
+      </w:r>
+    </w:p>
+    <w:p>
+      <w:pPr>
         <w:pStyle w:val="Heading1"/>
       </w:pPr>
       <w:r>
         <w:rPr>
           <w:rFonts w:ascii="맑은 고딕" w:hAnsi="맑은 고딕" w:eastAsia="맑은 고딕"/>
           <w:b/>
-          <w:sz w:val="36"/>
+          <w:color w:val="162033"/>
+          <w:sz w:val="32"/>
         </w:rPr>
         <w:t>7. Streamlit 앱 구현</w:t>
       </w:r>
@@ -2220,7 +2641,7 @@
           <w:b w:val="0"/>
           <w:sz w:val="21"/>
         </w:rPr>
-        <w:t>웹 앱은 Streamlit으로 구현하였다. 사용자가 결과를 쉽게 확인할 수 있도록 상단 히어로 영역, 자동차 정보 입력 폼, 모델 성능 요약, 모델별 성능 비교표, 특성 영향 분석 영역으로 구성하였다.</w:t>
+        <w:t>웹 앱은 Streamlit으로 구현하였다. 사용자가 차량 정보를 입력하고 버튼을 누르면 최종 모델이 예상 MPG를 계산한다. 화면에는 모델 성능, 모델별 비교, 최근 예측 기록, 특성 영향 분석이 함께 표시된다.</w:t>
       </w:r>
     </w:p>
     <w:p>
@@ -2231,9 +2652,9 @@
         <w:rPr>
           <w:rFonts w:ascii="맑은 고딕" w:hAnsi="맑은 고딕" w:eastAsia="맑은 고딕"/>
           <w:b w:val="0"/>
-          <w:sz w:val="21"/>
+          <w:sz w:val="20"/>
         </w:rPr>
-        <w:t>사용자 입력값: 실린더 수, 배기량, 마력, 무게, 가속력, 연식</w:t>
+        <w:t>입력값: 실린더 수, 배기량, 마력, 무게, 가속력, 연식</w:t>
       </w:r>
     </w:p>
     <w:p>
@@ -2244,9 +2665,9 @@
         <w:rPr>
           <w:rFonts w:ascii="맑은 고딕" w:hAnsi="맑은 고딕" w:eastAsia="맑은 고딕"/>
           <w:b w:val="0"/>
-          <w:sz w:val="21"/>
+          <w:sz w:val="20"/>
         </w:rPr>
-        <w:t>출력값: 예상 연비(MPG), 최종 선택 모델, 성능 지표, 특성 영향도</w:t>
+        <w:t>출력값: 예상 연비(MPG), 최종 선택 모델, 성능 지표</w:t>
       </w:r>
     </w:p>
     <w:p>
@@ -2257,7 +2678,7 @@
         <w:rPr>
           <w:rFonts w:ascii="맑은 고딕" w:hAnsi="맑은 고딕" w:eastAsia="맑은 고딕"/>
           <w:b w:val="0"/>
-          <w:sz w:val="21"/>
+          <w:sz w:val="20"/>
         </w:rPr>
         <w:t>Streamlit Cloud 배포를 고려하여 MariaDB 저장 기능은 기본 비활성화하였다.</w:t>
       </w:r>
@@ -2270,7 +2691,7 @@
         <w:rPr>
           <w:rFonts w:ascii="맑은 고딕" w:hAnsi="맑은 고딕" w:eastAsia="맑은 고딕"/>
           <w:b w:val="0"/>
-          <w:sz w:val="21"/>
+          <w:sz w:val="20"/>
         </w:rPr>
         <w:t>로컬 환경에서 ENABLE_DB=true를 설정하면 MariaDB 저장 기능을 사용할 수 있다.</w:t>
       </w:r>
@@ -2283,7 +2704,8 @@
         <w:rPr>
           <w:rFonts w:ascii="맑은 고딕" w:hAnsi="맑은 고딕" w:eastAsia="맑은 고딕"/>
           <w:b/>
-          <w:sz w:val="36"/>
+          <w:color w:val="162033"/>
+          <w:sz w:val="32"/>
         </w:rPr>
         <w:t>8. 결론 및 향후 개선 방향</w:t>
       </w:r>
@@ -2298,7 +2720,7 @@
           <w:b w:val="0"/>
           <w:sz w:val="21"/>
         </w:rPr>
-        <w:t>본 프로젝트는 Auto MPG 데이터를 활용하여 회귀 모델을 학습하고, 성능 비교를 통해 최종 모델을 선택한 뒤 Streamlit 앱으로 배포 가능한 형태까지 구현하였다. 제출 산출물은 모델 학습 노트북, 한글 보고서, Streamlit 앱으로 구성된다.</w:t>
+        <w:t>본 프로젝트는 Auto MPG 데이터를 활용하여 여러 회귀 모델을 학습하고, 성능 비교를 통해 최종 모델을 선택한 뒤 Streamlit 앱으로 배포 가능한 형태까지 구현하였다. 제출 산출물은 모델 학습 노트북, 한글 보고서, Streamlit 앱으로 구성된다.</w:t>
       </w:r>
     </w:p>
     <w:p>
@@ -2309,9 +2731,9 @@
         <w:rPr>
           <w:rFonts w:ascii="맑은 고딕" w:hAnsi="맑은 고딕" w:eastAsia="맑은 고딕"/>
           <w:b w:val="0"/>
-          <w:sz w:val="21"/>
+          <w:sz w:val="20"/>
         </w:rPr>
-        <w:t>추가 데이터가 확보되면 제조사, 차량명, 국가(origin) 등 범주형 변수를 포함해 예측 성능을 높일 수 있다.</w:t>
+        <w:t>추가 데이터가 확보되면 제조사, 차량명, 국가(origin) 등 범주형 변수를 포함할 수 있다.</w:t>
       </w:r>
     </w:p>
     <w:p>
@@ -2322,9 +2744,9 @@
         <w:rPr>
           <w:rFonts w:ascii="맑은 고딕" w:hAnsi="맑은 고딕" w:eastAsia="맑은 고딕"/>
           <w:b w:val="0"/>
-          <w:sz w:val="21"/>
+          <w:sz w:val="20"/>
         </w:rPr>
-        <w:t>모델별 하이퍼파라미터 튜닝을 수행하면 랜덤 포레스트나 KNN 회귀의 성능 개선을 기대할 수 있다.</w:t>
+        <w:t>하이퍼파라미터 튜닝을 추가하면 모델 성능을 더 개선할 수 있다.</w:t>
       </w:r>
     </w:p>
     <w:p>
@@ -2335,7 +2757,7 @@
         <w:rPr>
           <w:rFonts w:ascii="맑은 고딕" w:hAnsi="맑은 고딕" w:eastAsia="맑은 고딕"/>
           <w:b w:val="0"/>
-          <w:sz w:val="21"/>
+          <w:sz w:val="20"/>
         </w:rPr>
         <w:t>클라우드 DB를 연결하면 Streamlit Cloud에서도 예측 기록 저장 기능을 사용할 수 있다.</w:t>
       </w:r>
@@ -2348,7 +2770,8 @@
         <w:rPr>
           <w:rFonts w:ascii="맑은 고딕" w:hAnsi="맑은 고딕" w:eastAsia="맑은 고딕"/>
           <w:b/>
-          <w:sz w:val="36"/>
+          <w:color w:val="162033"/>
+          <w:sz w:val="32"/>
         </w:rPr>
         <w:t>9. 참고 자료</w:t>
       </w:r>
@@ -2361,7 +2784,7 @@
         <w:rPr>
           <w:rFonts w:ascii="맑은 고딕" w:hAnsi="맑은 고딕" w:eastAsia="맑은 고딕"/>
           <w:b w:val="0"/>
-          <w:sz w:val="21"/>
+          <w:sz w:val="20"/>
         </w:rPr>
         <w:t>UCI Machine Learning Repository, Auto MPG Dataset</w:t>
       </w:r>
@@ -2374,7 +2797,7 @@
         <w:rPr>
           <w:rFonts w:ascii="맑은 고딕" w:hAnsi="맑은 고딕" w:eastAsia="맑은 고딕"/>
           <w:b w:val="0"/>
-          <w:sz w:val="21"/>
+          <w:sz w:val="20"/>
         </w:rPr>
         <w:t>Seaborn Data Repository, mpg.csv</w:t>
       </w:r>
@@ -2387,7 +2810,7 @@
         <w:rPr>
           <w:rFonts w:ascii="맑은 고딕" w:hAnsi="맑은 고딕" w:eastAsia="맑은 고딕"/>
           <w:b w:val="0"/>
-          <w:sz w:val="21"/>
+          <w:sz w:val="20"/>
         </w:rPr>
         <w:t>scikit-learn Documentation</w:t>
       </w:r>
@@ -2400,14 +2823,14 @@
         <w:rPr>
           <w:rFonts w:ascii="맑은 고딕" w:hAnsi="맑은 고딕" w:eastAsia="맑은 고딕"/>
           <w:b w:val="0"/>
-          <w:sz w:val="21"/>
+          <w:sz w:val="20"/>
         </w:rPr>
         <w:t>Streamlit Documentation</w:t>
       </w:r>
     </w:p>
     <w:sectPr>
       <w:pgSz w:w="12240" w:h="15840"/>
-      <w:pgMar w:top="1440" w:right="1800" w:bottom="1440" w:left="1800" w:header="720" w:footer="720" w:gutter="0"/>
+      <w:pgMar w:top="1080" w:right="1080" w:bottom="1080" w:left="1080" w:header="720" w:footer="720" w:gutter="0"/>
       <w:cols w:space="720"/>
       <w:docGrid w:linePitch="360"/>
     </w:sectPr>
@@ -2780,6 +3203,7 @@
     <w:rsid w:val="00FC693F"/>
     <w:rPr>
       <w:rFonts w:ascii="맑은 고딕" w:hAnsi="맑은 고딕" w:eastAsia="맑은 고딕"/>
+      <w:sz w:val="21"/>
     </w:rPr>
   </w:style>
   <w:style w:type="paragraph" w:styleId="Header">

</xml_diff>